<commit_message>
paper: remove all GitHub references; consolidate data availability to OSF only (Declarations + Methods/Software)
</commit_message>
<xml_diff>
--- a/metaanalysis/paper/manuscript_journal.docx
+++ b/metaanalysis/paper/manuscript_journal.docx
@@ -312,7 +312,7 @@
           <w:rFonts w:ascii="Times New Roman" w:hAnsi="Times New Roman" w:eastAsia="Times New Roman"/>
           <w:sz w:val="24"/>
         </w:rPr>
-        <w:t>All extracted data, analysis code, search logs, and supplementary materials are publicly available on the OSF project page (https://osf.io/79m5j/) and the accompanying GitHub repository (https://github.com/etoki/paper, directory metaanalysis/).</w:t>
+        <w:t>All extracted data, analysis code, search logs, risk-of-bias ratings, figures, and supplementary materials are publicly available on the associated OSF project (https://osf.io/79m5j/). The complete data extraction CSV, R and Python analysis scripts, pooled results, moderator analyses, sensitivity analyses, and the generating code for all tables and figures are deposited in the corresponding OSF components (01_protocol, 02_search, 04_extraction, 06_analysis).</w:t>
       </w:r>
     </w:p>
     <w:p>
@@ -3140,7 +3140,7 @@
           <w:rFonts w:ascii="Times New Roman" w:hAnsi="Times New Roman" w:eastAsia="Times New Roman"/>
           <w:sz w:val="24"/>
         </w:rPr>
-        <w:t>All quantitative analyses were performed in R (version ≥ 4.3.0) using the metafor package (Viechtbauer, 2010) as the primary engine for random-effects meta-analysis, mixed-effects meta-regression, and heterogeneity diagnostics. The clubSandwich package was used for robust variance estimation (Pustejovsky, 2023), and the dmetar companion package (Harrer et al., 2021) was used for auxiliary diagnostic and plotting functions. Visualizations, including forest plots, funnel plots, and bubble plots, were produced using ggplot2. All analysis code, session information (sessionInfo() output), and a pinned package-version lockfile (renv.lock) are deposited on the accompanying OSF project (https://osf.io/79m5j/) and GitHub repository (https://github.com/etoki/paper, directory metaanalysis/). Any interested researcher can reproduce every analytic step reported in this paper from the deposited extraction CSV and the R scripts.</w:t>
+        <w:t>All quantitative analyses were performed in R (version ≥ 4.3.0) using the metafor package (Viechtbauer, 2010) as the primary engine for random-effects meta-analysis, mixed-effects meta-regression, and heterogeneity diagnostics. The clubSandwich package was used for robust variance estimation (Pustejovsky, 2023), and the dmetar companion package (Harrer et al., 2021) was used for auxiliary diagnostic and plotting functions. Visualizations, including forest plots, funnel plots, and bubble plots, were produced using ggplot2. All analysis code, session information (sessionInfo() output), and a pinned package-version lockfile (renv.lock) are deposited on the associated OSF project (https://osf.io/79m5j/), in the 06_analysis component. Any interested researcher can reproduce every analytic step reported in this paper from the deposited extraction CSV and the R scripts.</w:t>
       </w:r>
     </w:p>
     <w:p>

</xml_diff>

<commit_message>
paper: T1 add APA 7 running head 'BIG FIVE AND ONLINE LEARNING' + right-aligned page number
</commit_message>
<xml_diff>
--- a/metaanalysis/paper/manuscript_journal.docx
+++ b/metaanalysis/paper/manuscript_journal.docx
@@ -22819,7 +22819,7 @@
                     <pic:cNvPicPr/>
                   </pic:nvPicPr>
                   <pic:blipFill>
-                    <a:blip r:embed="rId9"/>
+                    <a:blip r:embed="rId10"/>
                     <a:stretch>
                       <a:fillRect/>
                     </a:stretch>
@@ -23021,7 +23021,7 @@
                     <pic:cNvPicPr/>
                   </pic:nvPicPr>
                   <pic:blipFill>
-                    <a:blip r:embed="rId10"/>
+                    <a:blip r:embed="rId11"/>
                     <a:stretch>
                       <a:fillRect/>
                     </a:stretch>
@@ -23108,96 +23108,6 @@
                 <pic:pic>
                   <pic:nvPicPr>
                     <pic:cNvPr id="0" name="forest_A.png"/>
-                    <pic:cNvPicPr/>
-                  </pic:nvPicPr>
-                  <pic:blipFill>
-                    <a:blip r:embed="rId11"/>
-                    <a:stretch>
-                      <a:fillRect/>
-                    </a:stretch>
-                  </pic:blipFill>
-                  <pic:spPr>
-                    <a:xfrm>
-                      <a:off x="0" y="0"/>
-                      <a:ext cx="5486400" cy="3403941"/>
-                    </a:xfrm>
-                    <a:prstGeom prst="rect"/>
-                  </pic:spPr>
-                </pic:pic>
-              </a:graphicData>
-            </a:graphic>
-          </wp:inline>
-        </w:drawing>
-      </w:r>
-    </w:p>
-    <w:p>
-      <w:pPr>
-        <w:spacing w:line="480" w:lineRule="auto" w:before="0" w:after="0"/>
-      </w:pPr>
-      <w:r>
-        <w:rPr>
-          <w:rFonts w:ascii="Times New Roman" w:hAnsi="Times New Roman"/>
-          <w:i/>
-          <w:sz w:val="22"/>
-        </w:rPr>
-        <w:t xml:space="preserve">Note. </w:t>
-      </w:r>
-      <w:r>
-        <w:rPr>
-          <w:rFonts w:ascii="Times New Roman" w:hAnsi="Times New Roman"/>
-          <w:sz w:val="22"/>
-        </w:rPr>
-        <w:t>Forest plot of study-level Pearson correlations between Agreeableness and academic achievement in online learning environments. Each square represents a study; square size is proportional to the inverse-variance weight. Horizontal bars show 95% confidence intervals. The red diamond represents the random-effects REML pooled estimate with HKSJ 95% confidence interval. Studies are sorted by effect size (descending). See Table 2 for pooled statistics.</w:t>
-      </w:r>
-    </w:p>
-    <w:p>
-      <w:r>
-        <w:br w:type="page"/>
-      </w:r>
-    </w:p>
-    <w:p>
-      <w:pPr>
-        <w:spacing w:line="480" w:lineRule="auto" w:before="0" w:after="0"/>
-      </w:pPr>
-      <w:r>
-        <w:rPr>
-          <w:rFonts w:ascii="Times New Roman" w:hAnsi="Times New Roman"/>
-          <w:b/>
-          <w:sz w:val="24"/>
-        </w:rPr>
-        <w:t>Figure 4</w:t>
-      </w:r>
-    </w:p>
-    <w:p>
-      <w:pPr>
-        <w:spacing w:line="480" w:lineRule="auto" w:before="0" w:after="0"/>
-      </w:pPr>
-      <w:r>
-        <w:rPr>
-          <w:rFonts w:ascii="Times New Roman" w:hAnsi="Times New Roman"/>
-          <w:i/>
-          <w:sz w:val="24"/>
-        </w:rPr>
-        <w:t>Forest Plot: Openness and Academic Achievement in Online Learning Environments</w:t>
-      </w:r>
-    </w:p>
-    <w:p>
-      <w:pPr>
-        <w:jc w:val="center"/>
-      </w:pPr>
-      <w:r>
-        <w:drawing>
-          <wp:inline xmlns:a="http://schemas.openxmlformats.org/drawingml/2006/main" xmlns:pic="http://schemas.openxmlformats.org/drawingml/2006/picture">
-            <wp:extent cx="5486400" cy="3403941"/>
-            <wp:docPr id="4" name="Picture 4"/>
-            <wp:cNvGraphicFramePr>
-              <a:graphicFrameLocks noChangeAspect="1"/>
-            </wp:cNvGraphicFramePr>
-            <a:graphic>
-              <a:graphicData uri="http://schemas.openxmlformats.org/drawingml/2006/picture">
-                <pic:pic>
-                  <pic:nvPicPr>
-                    <pic:cNvPr id="0" name="forest_O.png"/>
                     <pic:cNvPicPr/>
                   </pic:nvPicPr>
                   <pic:blipFill>
@@ -23237,6 +23147,96 @@
           <w:rFonts w:ascii="Times New Roman" w:hAnsi="Times New Roman"/>
           <w:sz w:val="22"/>
         </w:rPr>
+        <w:t>Forest plot of study-level Pearson correlations between Agreeableness and academic achievement in online learning environments. Each square represents a study; square size is proportional to the inverse-variance weight. Horizontal bars show 95% confidence intervals. The red diamond represents the random-effects REML pooled estimate with HKSJ 95% confidence interval. Studies are sorted by effect size (descending). See Table 2 for pooled statistics.</w:t>
+      </w:r>
+    </w:p>
+    <w:p>
+      <w:r>
+        <w:br w:type="page"/>
+      </w:r>
+    </w:p>
+    <w:p>
+      <w:pPr>
+        <w:spacing w:line="480" w:lineRule="auto" w:before="0" w:after="0"/>
+      </w:pPr>
+      <w:r>
+        <w:rPr>
+          <w:rFonts w:ascii="Times New Roman" w:hAnsi="Times New Roman"/>
+          <w:b/>
+          <w:sz w:val="24"/>
+        </w:rPr>
+        <w:t>Figure 4</w:t>
+      </w:r>
+    </w:p>
+    <w:p>
+      <w:pPr>
+        <w:spacing w:line="480" w:lineRule="auto" w:before="0" w:after="0"/>
+      </w:pPr>
+      <w:r>
+        <w:rPr>
+          <w:rFonts w:ascii="Times New Roman" w:hAnsi="Times New Roman"/>
+          <w:i/>
+          <w:sz w:val="24"/>
+        </w:rPr>
+        <w:t>Forest Plot: Openness and Academic Achievement in Online Learning Environments</w:t>
+      </w:r>
+    </w:p>
+    <w:p>
+      <w:pPr>
+        <w:jc w:val="center"/>
+      </w:pPr>
+      <w:r>
+        <w:drawing>
+          <wp:inline xmlns:a="http://schemas.openxmlformats.org/drawingml/2006/main" xmlns:pic="http://schemas.openxmlformats.org/drawingml/2006/picture">
+            <wp:extent cx="5486400" cy="3403941"/>
+            <wp:docPr id="4" name="Picture 4"/>
+            <wp:cNvGraphicFramePr>
+              <a:graphicFrameLocks noChangeAspect="1"/>
+            </wp:cNvGraphicFramePr>
+            <a:graphic>
+              <a:graphicData uri="http://schemas.openxmlformats.org/drawingml/2006/picture">
+                <pic:pic>
+                  <pic:nvPicPr>
+                    <pic:cNvPr id="0" name="forest_O.png"/>
+                    <pic:cNvPicPr/>
+                  </pic:nvPicPr>
+                  <pic:blipFill>
+                    <a:blip r:embed="rId13"/>
+                    <a:stretch>
+                      <a:fillRect/>
+                    </a:stretch>
+                  </pic:blipFill>
+                  <pic:spPr>
+                    <a:xfrm>
+                      <a:off x="0" y="0"/>
+                      <a:ext cx="5486400" cy="3403941"/>
+                    </a:xfrm>
+                    <a:prstGeom prst="rect"/>
+                  </pic:spPr>
+                </pic:pic>
+              </a:graphicData>
+            </a:graphic>
+          </wp:inline>
+        </w:drawing>
+      </w:r>
+    </w:p>
+    <w:p>
+      <w:pPr>
+        <w:spacing w:line="480" w:lineRule="auto" w:before="0" w:after="0"/>
+      </w:pPr>
+      <w:r>
+        <w:rPr>
+          <w:rFonts w:ascii="Times New Roman" w:hAnsi="Times New Roman"/>
+          <w:i/>
+          <w:sz w:val="22"/>
+        </w:rPr>
+        <w:t xml:space="preserve">Note. </w:t>
+      </w:r>
+      <w:r>
+        <w:rPr>
+          <w:rFonts w:ascii="Times New Roman" w:hAnsi="Times New Roman"/>
+          <w:sz w:val="22"/>
+        </w:rPr>
         <w:t>Forest plot of study-level Pearson correlations between Openness and academic achievement in online learning environments. Each square represents a study; square size is proportional to the inverse-variance weight. Horizontal bars show 95% confidence intervals. The red diamond represents the random-effects REML pooled estimate with HKSJ 95% confidence interval. Studies are sorted by effect size (descending). See Table 2 for pooled statistics.</w:t>
       </w:r>
     </w:p>
@@ -23291,7 +23291,7 @@
                     <pic:cNvPicPr/>
                   </pic:nvPicPr>
                   <pic:blipFill>
-                    <a:blip r:embed="rId13"/>
+                    <a:blip r:embed="rId14"/>
                     <a:stretch>
                       <a:fillRect/>
                     </a:stretch>
@@ -23381,7 +23381,7 @@
                     <pic:cNvPicPr/>
                   </pic:nvPicPr>
                   <pic:blipFill>
-                    <a:blip r:embed="rId14"/>
+                    <a:blip r:embed="rId15"/>
                     <a:stretch>
                       <a:fillRect/>
                     </a:stretch>
@@ -23468,103 +23468,6 @@
                 <pic:pic>
                   <pic:nvPicPr>
                     <pic:cNvPr id="0" name="funnel_C.png"/>
-                    <pic:cNvPicPr/>
-                  </pic:nvPicPr>
-                  <pic:blipFill>
-                    <a:blip r:embed="rId15"/>
-                    <a:stretch>
-                      <a:fillRect/>
-                    </a:stretch>
-                  </pic:blipFill>
-                  <pic:spPr>
-                    <a:xfrm>
-                      <a:off x="0" y="0"/>
-                      <a:ext cx="4572000" cy="3909391"/>
-                    </a:xfrm>
-                    <a:prstGeom prst="rect"/>
-                  </pic:spPr>
-                </pic:pic>
-              </a:graphicData>
-            </a:graphic>
-          </wp:inline>
-        </w:drawing>
-      </w:r>
-    </w:p>
-    <w:p>
-      <w:pPr>
-        <w:spacing w:line="480" w:lineRule="auto" w:before="0" w:after="0"/>
-      </w:pPr>
-      <w:r>
-        <w:rPr>
-          <w:rFonts w:ascii="Times New Roman" w:hAnsi="Times New Roman" w:eastAsia="Times New Roman"/>
-          <w:sz w:val="24"/>
-        </w:rPr>
-        <w:t xml:space="preserve">Note. Funnel plot of Pearson correlations between Conscientiousness and academic achievement in online learning environments. Points represent individual studies. The vertical dashed red line indicates the random-effects pooled correlation. Diagonal dashed lines represent pseudo-95% confidence bounds under the assumption of no heterogeneity. Asymmetric dispersion may suggest small-study effects or publication bias. Egger's test results: intercept = 2.14, </w:t>
-      </w:r>
-      <w:r>
-        <w:rPr>
-          <w:rFonts w:ascii="Times New Roman" w:hAnsi="Times New Roman" w:eastAsia="Times New Roman"/>
-          <w:i/>
-          <w:sz w:val="24"/>
-        </w:rPr>
-        <w:t>p</w:t>
-      </w:r>
-      <w:r>
-        <w:rPr>
-          <w:rFonts w:ascii="Times New Roman" w:hAnsi="Times New Roman" w:eastAsia="Times New Roman"/>
-          <w:sz w:val="24"/>
-        </w:rPr>
-        <w:t xml:space="preserve"> = .094. See Table 4 for full publication-bias assessment.</w:t>
-      </w:r>
-    </w:p>
-    <w:p>
-      <w:r>
-        <w:br w:type="page"/>
-      </w:r>
-    </w:p>
-    <w:p>
-      <w:pPr>
-        <w:spacing w:line="480" w:lineRule="auto" w:before="0" w:after="0"/>
-      </w:pPr>
-      <w:r>
-        <w:rPr>
-          <w:rFonts w:ascii="Times New Roman" w:hAnsi="Times New Roman"/>
-          <w:b/>
-          <w:sz w:val="24"/>
-        </w:rPr>
-        <w:t>Figure 8</w:t>
-      </w:r>
-    </w:p>
-    <w:p>
-      <w:pPr>
-        <w:spacing w:line="480" w:lineRule="auto" w:before="0" w:after="0"/>
-      </w:pPr>
-      <w:r>
-        <w:rPr>
-          <w:rFonts w:ascii="Times New Roman" w:hAnsi="Times New Roman"/>
-          <w:i/>
-          <w:sz w:val="24"/>
-        </w:rPr>
-        <w:t>Funnel Plot: Agreeableness and Academic Achievement in Online Learning Environments</w:t>
-      </w:r>
-    </w:p>
-    <w:p>
-      <w:pPr>
-        <w:jc w:val="center"/>
-      </w:pPr>
-      <w:r>
-        <w:drawing>
-          <wp:inline xmlns:a="http://schemas.openxmlformats.org/drawingml/2006/main" xmlns:pic="http://schemas.openxmlformats.org/drawingml/2006/picture">
-            <wp:extent cx="4572000" cy="3909391"/>
-            <wp:docPr id="8" name="Picture 8"/>
-            <wp:cNvGraphicFramePr>
-              <a:graphicFrameLocks noChangeAspect="1"/>
-            </wp:cNvGraphicFramePr>
-            <a:graphic>
-              <a:graphicData uri="http://schemas.openxmlformats.org/drawingml/2006/picture">
-                <pic:pic>
-                  <pic:nvPicPr>
-                    <pic:cNvPr id="0" name="funnel_A.png"/>
                     <pic:cNvPicPr/>
                   </pic:nvPicPr>
                   <pic:blipFill>
@@ -23596,7 +23499,7 @@
           <w:rFonts w:ascii="Times New Roman" w:hAnsi="Times New Roman" w:eastAsia="Times New Roman"/>
           <w:sz w:val="24"/>
         </w:rPr>
-        <w:t xml:space="preserve">Note. Funnel plot of Pearson correlations between Agreeableness and academic achievement in online learning environments. Points represent individual studies. The vertical dashed red line indicates the random-effects pooled correlation. Diagonal dashed lines represent pseudo-95% confidence bounds under the assumption of no heterogeneity. Asymmetric dispersion may suggest small-study effects or publication bias. Egger's test results: intercept = −8.53, </w:t>
+        <w:t xml:space="preserve">Note. Funnel plot of Pearson correlations between Conscientiousness and academic achievement in online learning environments. Points represent individual studies. The vertical dashed red line indicates the random-effects pooled correlation. Diagonal dashed lines represent pseudo-95% confidence bounds under the assumption of no heterogeneity. Asymmetric dispersion may suggest small-study effects or publication bias. Egger's test results: intercept = 2.14, </w:t>
       </w:r>
       <w:r>
         <w:rPr>
@@ -23611,7 +23514,7 @@
           <w:rFonts w:ascii="Times New Roman" w:hAnsi="Times New Roman" w:eastAsia="Times New Roman"/>
           <w:sz w:val="24"/>
         </w:rPr>
-        <w:t xml:space="preserve"> = .072. See Table 4 for full publication-bias assessment.</w:t>
+        <w:t xml:space="preserve"> = .094. See Table 4 for full publication-bias assessment.</w:t>
       </w:r>
     </w:p>
     <w:p>
@@ -23629,7 +23532,7 @@
           <w:b/>
           <w:sz w:val="24"/>
         </w:rPr>
-        <w:t>Figure 9</w:t>
+        <w:t>Figure 8</w:t>
       </w:r>
     </w:p>
     <w:p>
@@ -23642,7 +23545,7 @@
           <w:i/>
           <w:sz w:val="24"/>
         </w:rPr>
-        <w:t>Funnel Plot: Openness and Academic Achievement in Online Learning Environments</w:t>
+        <w:t>Funnel Plot: Agreeableness and Academic Achievement in Online Learning Environments</w:t>
       </w:r>
     </w:p>
     <w:p>
@@ -23653,7 +23556,7 @@
         <w:drawing>
           <wp:inline xmlns:a="http://schemas.openxmlformats.org/drawingml/2006/main" xmlns:pic="http://schemas.openxmlformats.org/drawingml/2006/picture">
             <wp:extent cx="4572000" cy="3909391"/>
-            <wp:docPr id="9" name="Picture 9"/>
+            <wp:docPr id="8" name="Picture 8"/>
             <wp:cNvGraphicFramePr>
               <a:graphicFrameLocks noChangeAspect="1"/>
             </wp:cNvGraphicFramePr>
@@ -23661,7 +23564,7 @@
               <a:graphicData uri="http://schemas.openxmlformats.org/drawingml/2006/picture">
                 <pic:pic>
                   <pic:nvPicPr>
-                    <pic:cNvPr id="0" name="funnel_O.png"/>
+                    <pic:cNvPr id="0" name="funnel_A.png"/>
                     <pic:cNvPicPr/>
                   </pic:nvPicPr>
                   <pic:blipFill>
@@ -23693,7 +23596,7 @@
           <w:rFonts w:ascii="Times New Roman" w:hAnsi="Times New Roman" w:eastAsia="Times New Roman"/>
           <w:sz w:val="24"/>
         </w:rPr>
-        <w:t xml:space="preserve">Note. Funnel plot of Pearson correlations between Openness and academic achievement in online learning environments. Points represent individual studies. The vertical dashed red line indicates the random-effects pooled correlation. Diagonal dashed lines represent pseudo-95% confidence bounds under the assumption of no heterogeneity. Asymmetric dispersion may suggest small-study effects or publication bias. Egger's test results: intercept = −6.41, </w:t>
+        <w:t xml:space="preserve">Note. Funnel plot of Pearson correlations between Agreeableness and academic achievement in online learning environments. Points represent individual studies. The vertical dashed red line indicates the random-effects pooled correlation. Diagonal dashed lines represent pseudo-95% confidence bounds under the assumption of no heterogeneity. Asymmetric dispersion may suggest small-study effects or publication bias. Egger's test results: intercept = −8.53, </w:t>
       </w:r>
       <w:r>
         <w:rPr>
@@ -23708,7 +23611,7 @@
           <w:rFonts w:ascii="Times New Roman" w:hAnsi="Times New Roman" w:eastAsia="Times New Roman"/>
           <w:sz w:val="24"/>
         </w:rPr>
-        <w:t xml:space="preserve"> = .045. See Table 4 for full publication-bias assessment.</w:t>
+        <w:t xml:space="preserve"> = .072. See Table 4 for full publication-bias assessment.</w:t>
       </w:r>
     </w:p>
     <w:p>
@@ -23726,7 +23629,7 @@
           <w:b/>
           <w:sz w:val="24"/>
         </w:rPr>
-        <w:t>Figure 10</w:t>
+        <w:t>Figure 9</w:t>
       </w:r>
     </w:p>
     <w:p>
@@ -23739,7 +23642,7 @@
           <w:i/>
           <w:sz w:val="24"/>
         </w:rPr>
-        <w:t>Funnel Plot: Neuroticism and Academic Achievement in Online Learning Environments</w:t>
+        <w:t>Funnel Plot: Openness and Academic Achievement in Online Learning Environments</w:t>
       </w:r>
     </w:p>
     <w:p>
@@ -23750,7 +23653,7 @@
         <w:drawing>
           <wp:inline xmlns:a="http://schemas.openxmlformats.org/drawingml/2006/main" xmlns:pic="http://schemas.openxmlformats.org/drawingml/2006/picture">
             <wp:extent cx="4572000" cy="3909391"/>
-            <wp:docPr id="10" name="Picture 10"/>
+            <wp:docPr id="9" name="Picture 9"/>
             <wp:cNvGraphicFramePr>
               <a:graphicFrameLocks noChangeAspect="1"/>
             </wp:cNvGraphicFramePr>
@@ -23758,7 +23661,7 @@
               <a:graphicData uri="http://schemas.openxmlformats.org/drawingml/2006/picture">
                 <pic:pic>
                   <pic:nvPicPr>
-                    <pic:cNvPr id="0" name="funnel_N.png"/>
+                    <pic:cNvPr id="0" name="funnel_O.png"/>
                     <pic:cNvPicPr/>
                   </pic:nvPicPr>
                   <pic:blipFill>
@@ -23790,7 +23693,7 @@
           <w:rFonts w:ascii="Times New Roman" w:hAnsi="Times New Roman" w:eastAsia="Times New Roman"/>
           <w:sz w:val="24"/>
         </w:rPr>
-        <w:t xml:space="preserve">Note. Funnel plot of Pearson correlations between Neuroticism and academic achievement in online learning environments. Points represent individual studies. The vertical dashed red line indicates the random-effects pooled correlation. Diagonal dashed lines represent pseudo-95% confidence bounds under the assumption of no heterogeneity. Asymmetric dispersion may suggest small-study effects or publication bias. Egger's test results: intercept = −1.79, </w:t>
+        <w:t xml:space="preserve">Note. Funnel plot of Pearson correlations between Openness and academic achievement in online learning environments. Points represent individual studies. The vertical dashed red line indicates the random-effects pooled correlation. Diagonal dashed lines represent pseudo-95% confidence bounds under the assumption of no heterogeneity. Asymmetric dispersion may suggest small-study effects or publication bias. Egger's test results: intercept = −6.41, </w:t>
       </w:r>
       <w:r>
         <w:rPr>
@@ -23805,7 +23708,7 @@
           <w:rFonts w:ascii="Times New Roman" w:hAnsi="Times New Roman" w:eastAsia="Times New Roman"/>
           <w:sz w:val="24"/>
         </w:rPr>
-        <w:t xml:space="preserve"> = .304. See Table 4 for full publication-bias assessment.</w:t>
+        <w:t xml:space="preserve"> = .045. See Table 4 for full publication-bias assessment.</w:t>
       </w:r>
     </w:p>
     <w:p>
@@ -23823,7 +23726,7 @@
           <w:b/>
           <w:sz w:val="24"/>
         </w:rPr>
-        <w:t>Figure 11</w:t>
+        <w:t>Figure 10</w:t>
       </w:r>
     </w:p>
     <w:p>
@@ -23836,7 +23739,7 @@
           <w:i/>
           <w:sz w:val="24"/>
         </w:rPr>
-        <w:t>Funnel Plot: Extraversion and Academic Achievement in Online Learning Environments</w:t>
+        <w:t>Funnel Plot: Neuroticism and Academic Achievement in Online Learning Environments</w:t>
       </w:r>
     </w:p>
     <w:p>
@@ -23847,7 +23750,7 @@
         <w:drawing>
           <wp:inline xmlns:a="http://schemas.openxmlformats.org/drawingml/2006/main" xmlns:pic="http://schemas.openxmlformats.org/drawingml/2006/picture">
             <wp:extent cx="4572000" cy="3909391"/>
-            <wp:docPr id="11" name="Picture 11"/>
+            <wp:docPr id="10" name="Picture 10"/>
             <wp:cNvGraphicFramePr>
               <a:graphicFrameLocks noChangeAspect="1"/>
             </wp:cNvGraphicFramePr>
@@ -23855,7 +23758,7 @@
               <a:graphicData uri="http://schemas.openxmlformats.org/drawingml/2006/picture">
                 <pic:pic>
                   <pic:nvPicPr>
-                    <pic:cNvPr id="0" name="funnel_E.png"/>
+                    <pic:cNvPr id="0" name="funnel_N.png"/>
                     <pic:cNvPicPr/>
                   </pic:nvPicPr>
                   <pic:blipFill>
@@ -23887,6 +23790,103 @@
           <w:rFonts w:ascii="Times New Roman" w:hAnsi="Times New Roman" w:eastAsia="Times New Roman"/>
           <w:sz w:val="24"/>
         </w:rPr>
+        <w:t xml:space="preserve">Note. Funnel plot of Pearson correlations between Neuroticism and academic achievement in online learning environments. Points represent individual studies. The vertical dashed red line indicates the random-effects pooled correlation. Diagonal dashed lines represent pseudo-95% confidence bounds under the assumption of no heterogeneity. Asymmetric dispersion may suggest small-study effects or publication bias. Egger's test results: intercept = −1.79, </w:t>
+      </w:r>
+      <w:r>
+        <w:rPr>
+          <w:rFonts w:ascii="Times New Roman" w:hAnsi="Times New Roman" w:eastAsia="Times New Roman"/>
+          <w:i/>
+          <w:sz w:val="24"/>
+        </w:rPr>
+        <w:t>p</w:t>
+      </w:r>
+      <w:r>
+        <w:rPr>
+          <w:rFonts w:ascii="Times New Roman" w:hAnsi="Times New Roman" w:eastAsia="Times New Roman"/>
+          <w:sz w:val="24"/>
+        </w:rPr>
+        <w:t xml:space="preserve"> = .304. See Table 4 for full publication-bias assessment.</w:t>
+      </w:r>
+    </w:p>
+    <w:p>
+      <w:r>
+        <w:br w:type="page"/>
+      </w:r>
+    </w:p>
+    <w:p>
+      <w:pPr>
+        <w:spacing w:line="480" w:lineRule="auto" w:before="0" w:after="0"/>
+      </w:pPr>
+      <w:r>
+        <w:rPr>
+          <w:rFonts w:ascii="Times New Roman" w:hAnsi="Times New Roman"/>
+          <w:b/>
+          <w:sz w:val="24"/>
+        </w:rPr>
+        <w:t>Figure 11</w:t>
+      </w:r>
+    </w:p>
+    <w:p>
+      <w:pPr>
+        <w:spacing w:line="480" w:lineRule="auto" w:before="0" w:after="0"/>
+      </w:pPr>
+      <w:r>
+        <w:rPr>
+          <w:rFonts w:ascii="Times New Roman" w:hAnsi="Times New Roman"/>
+          <w:i/>
+          <w:sz w:val="24"/>
+        </w:rPr>
+        <w:t>Funnel Plot: Extraversion and Academic Achievement in Online Learning Environments</w:t>
+      </w:r>
+    </w:p>
+    <w:p>
+      <w:pPr>
+        <w:jc w:val="center"/>
+      </w:pPr>
+      <w:r>
+        <w:drawing>
+          <wp:inline xmlns:a="http://schemas.openxmlformats.org/drawingml/2006/main" xmlns:pic="http://schemas.openxmlformats.org/drawingml/2006/picture">
+            <wp:extent cx="4572000" cy="3909391"/>
+            <wp:docPr id="11" name="Picture 11"/>
+            <wp:cNvGraphicFramePr>
+              <a:graphicFrameLocks noChangeAspect="1"/>
+            </wp:cNvGraphicFramePr>
+            <a:graphic>
+              <a:graphicData uri="http://schemas.openxmlformats.org/drawingml/2006/picture">
+                <pic:pic>
+                  <pic:nvPicPr>
+                    <pic:cNvPr id="0" name="funnel_E.png"/>
+                    <pic:cNvPicPr/>
+                  </pic:nvPicPr>
+                  <pic:blipFill>
+                    <a:blip r:embed="rId20"/>
+                    <a:stretch>
+                      <a:fillRect/>
+                    </a:stretch>
+                  </pic:blipFill>
+                  <pic:spPr>
+                    <a:xfrm>
+                      <a:off x="0" y="0"/>
+                      <a:ext cx="4572000" cy="3909391"/>
+                    </a:xfrm>
+                    <a:prstGeom prst="rect"/>
+                  </pic:spPr>
+                </pic:pic>
+              </a:graphicData>
+            </a:graphic>
+          </wp:inline>
+        </w:drawing>
+      </w:r>
+    </w:p>
+    <w:p>
+      <w:pPr>
+        <w:spacing w:line="480" w:lineRule="auto" w:before="0" w:after="0"/>
+      </w:pPr>
+      <w:r>
+        <w:rPr>
+          <w:rFonts w:ascii="Times New Roman" w:hAnsi="Times New Roman" w:eastAsia="Times New Roman"/>
+          <w:sz w:val="24"/>
+        </w:rPr>
         <w:t xml:space="preserve">Note. Funnel plot of Pearson correlations between Extraversion and academic achievement in online learning environments. Points represent individual studies. The vertical dashed red line indicates the random-effects pooled correlation. Diagonal dashed lines represent pseudo-95% confidence bounds under the assumption of no heterogeneity. Asymmetric dispersion may suggest small-study effects or publication bias. Egger's test results: intercept = 2.29, </w:t>
       </w:r>
       <w:r>
@@ -23906,6 +23906,7 @@
       </w:r>
     </w:p>
     <w:sectPr>
+      <w:headerReference w:type="default" r:id="rId9"/>
       <w:pgSz w:w="12240" w:h="15840"/>
       <w:pgMar w:top="1440" w:right="1440" w:bottom="1440" w:left="1440" w:header="720" w:footer="720" w:gutter="0"/>
       <w:cols w:space="720"/>
@@ -23913,6 +23914,37 @@
     </w:sectPr>
   </w:body>
 </w:document>
+</file>
+
+<file path=word/header1.xml><?xml version="1.0" encoding="utf-8"?>
+<w:hdr xmlns:m="http://schemas.openxmlformats.org/officeDocument/2006/math" xmlns:mc="http://schemas.openxmlformats.org/markup-compatibility/2006" xmlns:mo="http://schemas.microsoft.com/office/mac/office/2008/main" xmlns:mv="urn:schemas-microsoft-com:mac:vml" xmlns:o="urn:schemas-microsoft-com:office:office" xmlns:r="http://schemas.openxmlformats.org/officeDocument/2006/relationships" xmlns:v="urn:schemas-microsoft-com:vml" xmlns:w10="urn:schemas-microsoft-com:office:word" xmlns:w14="http://schemas.microsoft.com/office/word/2010/wordml" xmlns:w="http://schemas.openxmlformats.org/wordprocessingml/2006/main" xmlns:wne="http://schemas.microsoft.com/office/word/2006/wordml" xmlns:wp14="http://schemas.microsoft.com/office/word/2010/wordprocessingDrawing" xmlns:wp="http://schemas.openxmlformats.org/drawingml/2006/wordprocessingDrawing" xmlns:wpc="http://schemas.microsoft.com/office/word/2010/wordprocessingCanvas" xmlns:wpg="http://schemas.microsoft.com/office/word/2010/wordprocessingGroup" xmlns:wpi="http://schemas.microsoft.com/office/word/2010/wordprocessingInk" xmlns:wps="http://schemas.microsoft.com/office/word/2010/wordprocessingShape" mc:Ignorable="w14 wp14">
+  <w:p>
+    <w:pPr>
+      <w:pStyle w:val="Header"/>
+      <w:tabs>
+        <w:tab w:pos="9360" w:val="right"/>
+      </w:tabs>
+    </w:pPr>
+    <w:r>
+      <w:rPr>
+        <w:rFonts w:ascii="Times New Roman" w:hAnsi="Times New Roman" w:eastAsia="Times New Roman"/>
+        <w:sz w:val="24"/>
+      </w:rPr>
+      <w:t>BIG FIVE AND ONLINE LEARNING</w:t>
+      <w:tab/>
+      <w:tab/>
+    </w:r>
+    <w:r>
+      <w:rPr>
+        <w:rFonts w:ascii="Times New Roman" w:hAnsi="Times New Roman"/>
+        <w:sz w:val="24"/>
+      </w:rPr>
+      <w:fldChar w:fldCharType="begin"/>
+      <w:instrText xml:space="preserve">PAGE</w:instrText>
+      <w:fldChar w:fldCharType="end"/>
+    </w:r>
+  </w:p>
+</w:hdr>
 </file>
 
 <file path=word/numbering.xml><?xml version="1.0" encoding="utf-8"?>

</xml_diff>

<commit_message>
paper: T3 convert 3+ author narrative citations to 'et al.' (APA 7 rule: 6 instances fixed)
</commit_message>
<xml_diff>
--- a/metaanalysis/paper/manuscript_journal.docx
+++ b/metaanalysis/paper/manuscript_journal.docx
@@ -884,7 +884,7 @@
           <w:rFonts w:ascii="Times New Roman" w:hAnsi="Times New Roman" w:eastAsia="Times New Roman"/>
           <w:sz w:val="24"/>
         </w:rPr>
-        <w:t xml:space="preserve"> = .26), both restricted to tertiary education. Stajkovic, Bandura, Locke, Lee, and Sergent (2018) provided additional evidence that Conscientiousness predicts academic achievement both directly and indirectly through self-efficacy, with the self-efficacy path carrying a substantial proportion of the Conscientiousness effect (</w:t>
+        <w:t xml:space="preserve"> = .26), both restricted to tertiary education. Stajkovic et al. (2018) provided additional evidence that Conscientiousness predicts academic achievement both directly and indirectly through self-efficacy, with the self-efficacy path carrying a substantial proportion of the Conscientiousness effect (</w:t>
       </w:r>
       <w:r>
         <w:rPr>
@@ -1017,7 +1017,7 @@
           <w:rFonts w:ascii="Times New Roman" w:hAnsi="Times New Roman" w:eastAsia="Times New Roman"/>
           <w:sz w:val="24"/>
         </w:rPr>
-        <w:t xml:space="preserve"> = −.19). Meyer, Jansen, Hübner, and Lüdtke (2023), focusing exclusively on K-12 samples (110 samples, </w:t>
+        <w:t xml:space="preserve"> = −.19). Meyer et al. (2023), focusing exclusively on K-12 samples (110 samples, </w:t>
       </w:r>
       <w:r>
         <w:rPr>
@@ -1092,7 +1092,7 @@
           <w:rFonts w:ascii="Times New Roman" w:hAnsi="Times New Roman" w:eastAsia="Times New Roman"/>
           <w:sz w:val="24"/>
         </w:rPr>
-        <w:t xml:space="preserve"> = −.01. Most recently, Chen, Cheung, and Zeng (2025), examining 84 articles and 370 independent correlations restricted to university students with samples of at least 200 participants, reported somewhat smaller estimates (C </w:t>
+        <w:t xml:space="preserve"> = −.01. Most recently, Chen et al. (2025), examining 84 articles and 370 independent correlations restricted to university students with samples of at least 200 participants, reported somewhat smaller estimates (C </w:t>
       </w:r>
       <w:r>
         <w:rPr>
@@ -1262,7 +1262,7 @@
           <w:rFonts w:ascii="Times New Roman" w:hAnsi="Times New Roman" w:eastAsia="Times New Roman"/>
           <w:sz w:val="24"/>
         </w:rPr>
-        <w:t>Online learning environments differ from face-to-face instruction along at least four dimensions that have theoretical implications for the personality-achievement relationship. First, online environments impose heightened self-regulation demands on learners, who must manage their own time, attention, and task sequencing without the physical and social scaffolding provided by a traditional classroom (Broadbent &amp; Poon, 2015). This demand is likely to amplify the importance of Conscientiousness, and particularly its industriousness and orderliness facets, for academic success. Second, online environments reduce social presence: learners interact with instructors and peers through mediated channels, often asynchronously, and the rich nonverbal cues of in-person interaction are absent or attenuated. This reduction in social presence may alter the role of Extraversion, which in face-to-face contexts is weakly but positively associated with classroom participation and instructor rapport, but which may become irrelevant or even counterproductive in asynchronous environments where social interaction is limited. Third, online environments afford greater temporal flexibility, which can either support self-directed learning or, conversely, facilitate procrastination (Cheng, Chang, Quilantan-Garza, &amp; Gutierrez, 2023). Finally, online environments are technology-mediated, requiring engagement with novel digital platforms, learning management systems, and assessment tools; this technological novelty may engage Openness to Experience more strongly than in conventional classrooms, where instructional technology is more routine.</w:t>
+        <w:t>Online learning environments differ from face-to-face instruction along at least four dimensions that have theoretical implications for the personality-achievement relationship. First, online environments impose heightened self-regulation demands on learners, who must manage their own time, attention, and task sequencing without the physical and social scaffolding provided by a traditional classroom (Broadbent &amp; Poon, 2015). This demand is likely to amplify the importance of Conscientiousness, and particularly its industriousness and orderliness facets, for academic success. Second, online environments reduce social presence: learners interact with instructors and peers through mediated channels, often asynchronously, and the rich nonverbal cues of in-person interaction are absent or attenuated. This reduction in social presence may alter the role of Extraversion, which in face-to-face contexts is weakly but positively associated with classroom participation and instructor rapport, but which may become irrelevant or even counterproductive in asynchronous environments where social interaction is limited. Third, online environments afford greater temporal flexibility, which can either support self-directed learning or, conversely, facilitate procrastination (Cheng et al., 2023). Finally, online environments are technology-mediated, requiring engagement with novel digital platforms, learning management systems, and assessment tools; this technological novelty may engage Openness to Experience more strongly than in conventional classrooms, where instructional technology is more routine.</w:t>
       </w:r>
     </w:p>
     <w:p>
@@ -1400,7 +1400,7 @@
           <w:rFonts w:ascii="Times New Roman" w:hAnsi="Times New Roman" w:eastAsia="Times New Roman"/>
           <w:sz w:val="24"/>
         </w:rPr>
-        <w:t xml:space="preserve"> = .244), with other traits exhibiting only null effects. In the COVID-era German higher education context, Rodrigues, Rose, and Hewig (2024) reported a moderate negative correlation between Conscientiousness and self-reported GPA (</w:t>
+        <w:t xml:space="preserve"> = .244), with other traits exhibiting only null effects. In the COVID-era German higher education context, Rodrigues et al. (2024) reported a moderate negative correlation between Conscientiousness and self-reported GPA (</w:t>
       </w:r>
       <w:r>
         <w:rPr>
@@ -2806,7 +2806,7 @@
           <w:rFonts w:ascii="Times New Roman" w:hAnsi="Times New Roman" w:eastAsia="Times New Roman"/>
           <w:sz w:val="24"/>
         </w:rPr>
-        <w:t>Publication bias was assessed per trait using four complementary procedures: visual inspection of funnel plots with pseudo-95% confidence bounds; Egger's regression asymmetry test (Egger, Davey Smith, Schneider, &amp; Minder, 1997); Peters' regression test adapted for correlation effect sizes; and Duval and Tweedie's (2000) trim-and-fill procedure, reported as a sensitivity check rather than as a point-estimate correction. In addition, p-curve analysis (Simonsohn, Nelson, &amp; Simmons, 2014) was performed to evaluate the evidential value of the statistically significant primary findings. Grey literature—doctoral dissertations and peer-reviewed conference proceedings—was included in the primary synthesis to partially mitigate publication bias arising from the file-drawer problem, while unpublished manuscripts and non-peer-reviewed preprints were excluded for quality reasons; this trade-off is acknowledged as a limitation in the Discussion.</w:t>
+        <w:t>Publication bias was assessed per trait using four complementary procedures: visual inspection of funnel plots with pseudo-95% confidence bounds; Egger's regression asymmetry test (Egger et al., 1997); Peters' regression test adapted for correlation effect sizes; and Duval and Tweedie's (2000) trim-and-fill procedure, reported as a sensitivity check rather than as a point-estimate correction. In addition, p-curve analysis (Simonsohn et al., 2014) was performed to evaluate the evidential value of the statistically significant primary findings. Grey literature—doctoral dissertations and peer-reviewed conference proceedings—was included in the primary synthesis to partially mitigate publication bias arising from the file-drawer problem, while unpublished manuscripts and non-peer-reviewed preprints were excluded for quality reasons; this trade-off is acknowledged as a limitation in the Discussion.</w:t>
       </w:r>
     </w:p>
     <w:p>

</xml_diff>

<commit_message>
paper: apply 4 APA 7 convention fixes (Abstract 240w, Acknowledgments, Keywords commas, Author Note)
- Abstract shortened from 317 to 240 words (under APA 7 250-word limit);
  removed redundant methodological details already covered in Methods
- Added Acknowledgments section to Declarations (primary-study authors,
  open-access repositories, scientific Python stack)
- Keywords separator changed from semicolons to commas (APA 7 pure convention)
- Title page restructured with formal Author Note heading including ORCID,
  brief disclosures (pointing to Declarations), and correspondence info
</commit_message>
<xml_diff>
--- a/metaanalysis/paper/manuscript_journal.docx
+++ b/metaanalysis/paper/manuscript_journal.docx
@@ -51,6 +51,13 @@
         <w:spacing w:line="480" w:lineRule="auto" w:before="0" w:after="0"/>
         <w:jc w:val="center"/>
       </w:pPr>
+      <w:r>
+        <w:rPr>
+          <w:rFonts w:ascii="Times New Roman" w:hAnsi="Times New Roman" w:eastAsia="Times New Roman"/>
+          <w:sz w:val="24"/>
+        </w:rPr>
+        <w:t>Eisuke Tokiwa</w:t>
+      </w:r>
     </w:p>
     <w:p>
       <w:pPr>
@@ -62,7 +69,7 @@
           <w:rFonts w:ascii="Times New Roman" w:hAnsi="Times New Roman" w:eastAsia="Times New Roman"/>
           <w:sz w:val="24"/>
         </w:rPr>
-        <w:t>Eisuke Tokiwa</w:t>
+        <w:t>SUNBLAZE Co., Ltd., Tokyo, Japan</w:t>
       </w:r>
     </w:p>
     <w:p>
@@ -70,26 +77,12 @@
         <w:spacing w:line="480" w:lineRule="auto" w:before="0" w:after="0"/>
         <w:jc w:val="center"/>
       </w:pPr>
-      <w:r>
-        <w:rPr>
-          <w:rFonts w:ascii="Times New Roman" w:hAnsi="Times New Roman" w:eastAsia="Times New Roman"/>
-          <w:sz w:val="24"/>
-        </w:rPr>
-        <w:t>Founder of SUNBLAZE Co., Ltd.</w:t>
-      </w:r>
     </w:p>
     <w:p>
       <w:pPr>
         <w:spacing w:line="480" w:lineRule="auto" w:before="0" w:after="0"/>
         <w:jc w:val="center"/>
       </w:pPr>
-      <w:r>
-        <w:rPr>
-          <w:rFonts w:ascii="Times New Roman" w:hAnsi="Times New Roman" w:eastAsia="Times New Roman"/>
-          <w:sz w:val="24"/>
-        </w:rPr>
-        <w:t>Tokyo, Japan</w:t>
-      </w:r>
     </w:p>
     <w:p>
       <w:pPr>
@@ -99,22 +92,49 @@
       <w:r>
         <w:rPr>
           <w:rFonts w:ascii="Times New Roman" w:hAnsi="Times New Roman" w:eastAsia="Times New Roman"/>
-          <w:sz w:val="24"/>
-        </w:rPr>
-        <w:t>eisuke.tokiwa@sunblaze.jp</w:t>
+          <w:b/>
+          <w:sz w:val="24"/>
+        </w:rPr>
+        <w:t>Author Note</w:t>
       </w:r>
     </w:p>
     <w:p>
       <w:pPr>
         <w:spacing w:line="480" w:lineRule="auto" w:before="0" w:after="0"/>
-        <w:jc w:val="center"/>
+        <w:ind w:firstLine="720"/>
       </w:pPr>
       <w:r>
         <w:rPr>
           <w:rFonts w:ascii="Times New Roman" w:hAnsi="Times New Roman" w:eastAsia="Times New Roman"/>
           <w:sz w:val="24"/>
         </w:rPr>
-        <w:t>ORCID: 0009-0009-7124-6669</w:t>
+        <w:t>Eisuke Tokiwa https://orcid.org/0009-0009-7124-6669</w:t>
+      </w:r>
+    </w:p>
+    <w:p>
+      <w:pPr>
+        <w:spacing w:line="480" w:lineRule="auto" w:before="0" w:after="0"/>
+        <w:ind w:firstLine="720"/>
+      </w:pPr>
+      <w:r>
+        <w:rPr>
+          <w:rFonts w:ascii="Times New Roman" w:hAnsi="Times New Roman" w:eastAsia="Times New Roman"/>
+          <w:sz w:val="24"/>
+        </w:rPr>
+        <w:t>The author has no known conflict of interest to disclose beyond that stated in the Declarations section, where a pre-specified sensitivity analysis addresses the author's own potentially eligible primary study. This research received no external funding. The systematic review and meta-analysis was pre-registered on OSF Registries (https://doi.org/10.17605/OSF.IO/E5W47) prior to data extraction, and all data, analysis code, and supplementary materials are publicly available in the associated OSF project (https://doi.org/10.17605/OSF.IO/79M5J).</w:t>
+      </w:r>
+    </w:p>
+    <w:p>
+      <w:pPr>
+        <w:spacing w:line="480" w:lineRule="auto" w:before="0" w:after="0"/>
+        <w:ind w:firstLine="720"/>
+      </w:pPr>
+      <w:r>
+        <w:rPr>
+          <w:rFonts w:ascii="Times New Roman" w:hAnsi="Times New Roman" w:eastAsia="Times New Roman"/>
+          <w:sz w:val="24"/>
+        </w:rPr>
+        <w:t>Correspondence concerning this article should be addressed to Eisuke Tokiwa, SUNBLAZE Co., Ltd., Tokyo, Japan. Email: eisuke.tokiwa@sunblaze.jp</w:t>
       </w:r>
     </w:p>
     <w:p>
@@ -330,7 +350,7 @@
           <w:b/>
           <w:sz w:val="24"/>
         </w:rPr>
-        <w:t>Preprint Statement</w:t>
+        <w:t>Authors' contributions</w:t>
       </w:r>
     </w:p>
     <w:p>
@@ -342,7 +362,7 @@
           <w:rFonts w:ascii="Times New Roman" w:hAnsi="Times New Roman" w:eastAsia="Times New Roman"/>
           <w:sz w:val="24"/>
         </w:rPr>
-        <w:t>A preprint version of this manuscript has been deposited on Research Square (https://doi.org/[TO BE FILLED AFTER PREPRINT DOI IS ASSIGNED]). This preprint has not been peer-reviewed by a journal. Any substantive revisions introduced during peer review are reflected in the present journal version and in a versioned preprint update.</w:t>
+        <w:t>The author (ET) conceived and designed the review, developed the search strategy and eligibility criteria, performed the database searches, conducted screening, extracted data, performed the statistical analyses, and drafted and revised the manuscript. The author approves the final version.</w:t>
       </w:r>
     </w:p>
     <w:p>
@@ -360,7 +380,7 @@
           <w:b/>
           <w:sz w:val="24"/>
         </w:rPr>
-        <w:t>Authors' contributions</w:t>
+        <w:t>Preprint Statement</w:t>
       </w:r>
     </w:p>
     <w:p>
@@ -372,293 +392,7 @@
           <w:rFonts w:ascii="Times New Roman" w:hAnsi="Times New Roman" w:eastAsia="Times New Roman"/>
           <w:sz w:val="24"/>
         </w:rPr>
-        <w:t>The author (ET) conceived and designed the review, developed the search strategy and eligibility criteria, performed the database searches, conducted screening, extracted data, performed the statistical analyses, and drafted and revised the manuscript. The author approves the final version.</w:t>
-      </w:r>
-    </w:p>
-    <w:p>
-      <w:pPr>
-        <w:spacing w:line="480" w:lineRule="auto" w:before="0" w:after="0"/>
-      </w:pPr>
-    </w:p>
-    <w:p>
-      <w:r>
-        <w:br w:type="page"/>
-      </w:r>
-    </w:p>
-    <w:p>
-      <w:pPr>
-        <w:pStyle w:val="Heading1"/>
-        <w:spacing w:line="480" w:lineRule="auto" w:before="0" w:after="0"/>
-      </w:pPr>
-      <w:r>
-        <w:t>Abstract</w:t>
-      </w:r>
-    </w:p>
-    <w:p>
-      <w:pPr>
-        <w:spacing w:line="480" w:lineRule="auto" w:before="0" w:after="0"/>
-      </w:pPr>
-      <w:r>
-        <w:rPr>
-          <w:rFonts w:ascii="Times New Roman" w:hAnsi="Times New Roman" w:eastAsia="Times New Roman"/>
-          <w:sz w:val="24"/>
-        </w:rPr>
-        <w:t xml:space="preserve">Academic achievement in online learning environments has become a central concern for post-secondary education following the global shift toward digital instruction, yet existing meta-analyses of Big Five personality traits and academic performance have pooled samples across face-to-face, blended, and online modalities without testing delivery mode as a substantive moderator. The present systematic review and meta-analysis is the first quantitative synthesis dedicated to online learning environments. The review was pre-registered prior to data extraction. Following PRISMA 2020 reporting standards, 31 primary studies reporting associations between Big Five (or HEXACO) personality traits and academic achievement in online, blended, or MOOC environments were synthesized. Effect sizes were pooled using random-effects meta-analysis with Restricted Maximum Likelihood estimation and Hartung-Knapp-Sidik-Jonkman confidence-interval adjustment on the Fisher </w:t>
-      </w:r>
-      <w:r>
-        <w:rPr>
-          <w:rFonts w:ascii="Times New Roman" w:hAnsi="Times New Roman" w:eastAsia="Times New Roman"/>
-          <w:i/>
-          <w:sz w:val="24"/>
-        </w:rPr>
-        <w:t>z</w:t>
-      </w:r>
-      <w:r>
-        <w:rPr>
-          <w:rFonts w:ascii="Times New Roman" w:hAnsi="Times New Roman" w:eastAsia="Times New Roman"/>
-          <w:sz w:val="24"/>
-        </w:rPr>
-        <w:t xml:space="preserve"> scale. Ten studies (pooled </w:t>
-      </w:r>
-      <w:r>
-        <w:rPr>
-          <w:rFonts w:ascii="Times New Roman" w:hAnsi="Times New Roman" w:eastAsia="Times New Roman"/>
-          <w:i/>
-          <w:sz w:val="24"/>
-        </w:rPr>
-        <w:t>N</w:t>
-      </w:r>
-      <w:r>
-        <w:rPr>
-          <w:rFonts w:ascii="Times New Roman" w:hAnsi="Times New Roman" w:eastAsia="Times New Roman"/>
-          <w:sz w:val="24"/>
-        </w:rPr>
-        <w:t xml:space="preserve"> = 3,384) contributed direct Pearson correlations to the primary achievement pool. Conscientiousness emerged as the strongest positive predictor (pooled </w:t>
-      </w:r>
-      <w:r>
-        <w:rPr>
-          <w:rFonts w:ascii="Times New Roman" w:hAnsi="Times New Roman" w:eastAsia="Times New Roman"/>
-          <w:i/>
-          <w:sz w:val="24"/>
-        </w:rPr>
-        <w:t>r</w:t>
-      </w:r>
-      <w:r>
-        <w:rPr>
-          <w:rFonts w:ascii="Times New Roman" w:hAnsi="Times New Roman" w:eastAsia="Times New Roman"/>
-          <w:sz w:val="24"/>
-        </w:rPr>
-        <w:t xml:space="preserve"> = .167, 95% CI [.089, .243]; </w:t>
-      </w:r>
-      <w:r>
-        <w:rPr>
-          <w:rFonts w:ascii="Times New Roman" w:hAnsi="Times New Roman" w:eastAsia="Times New Roman"/>
-          <w:i/>
-          <w:sz w:val="24"/>
-        </w:rPr>
-        <w:t>I²</w:t>
-      </w:r>
-      <w:r>
-        <w:rPr>
-          <w:rFonts w:ascii="Times New Roman" w:hAnsi="Times New Roman" w:eastAsia="Times New Roman"/>
-          <w:sz w:val="24"/>
-        </w:rPr>
-        <w:t xml:space="preserve"> = 65.1%), followed by Agreeableness (</w:t>
-      </w:r>
-      <w:r>
-        <w:rPr>
-          <w:rFonts w:ascii="Times New Roman" w:hAnsi="Times New Roman" w:eastAsia="Times New Roman"/>
-          <w:i/>
-          <w:sz w:val="24"/>
-        </w:rPr>
-        <w:t>r</w:t>
-      </w:r>
-      <w:r>
-        <w:rPr>
-          <w:rFonts w:ascii="Times New Roman" w:hAnsi="Times New Roman" w:eastAsia="Times New Roman"/>
-          <w:sz w:val="24"/>
-        </w:rPr>
-        <w:t xml:space="preserve"> = .112 [−.031, .250]), Openness (</w:t>
-      </w:r>
-      <w:r>
-        <w:rPr>
-          <w:rFonts w:ascii="Times New Roman" w:hAnsi="Times New Roman" w:eastAsia="Times New Roman"/>
-          <w:i/>
-          <w:sz w:val="24"/>
-        </w:rPr>
-        <w:t>r</w:t>
-      </w:r>
-      <w:r>
-        <w:rPr>
-          <w:rFonts w:ascii="Times New Roman" w:hAnsi="Times New Roman" w:eastAsia="Times New Roman"/>
-          <w:sz w:val="24"/>
-        </w:rPr>
-        <w:t xml:space="preserve"> = .086 [−.044, .214]), Neuroticism (</w:t>
-      </w:r>
-      <w:r>
-        <w:rPr>
-          <w:rFonts w:ascii="Times New Roman" w:hAnsi="Times New Roman" w:eastAsia="Times New Roman"/>
-          <w:i/>
-          <w:sz w:val="24"/>
-        </w:rPr>
-        <w:t>r</w:t>
-      </w:r>
-      <w:r>
-        <w:rPr>
-          <w:rFonts w:ascii="Times New Roman" w:hAnsi="Times New Roman" w:eastAsia="Times New Roman"/>
-          <w:sz w:val="24"/>
-        </w:rPr>
-        <w:t xml:space="preserve"> = .018 [−.079, .114]), and Extraversion (</w:t>
-      </w:r>
-      <w:r>
-        <w:rPr>
-          <w:rFonts w:ascii="Times New Roman" w:hAnsi="Times New Roman" w:eastAsia="Times New Roman"/>
-          <w:i/>
-          <w:sz w:val="24"/>
-        </w:rPr>
-        <w:t>r</w:t>
-      </w:r>
-      <w:r>
-        <w:rPr>
-          <w:rFonts w:ascii="Times New Roman" w:hAnsi="Times New Roman" w:eastAsia="Times New Roman"/>
-          <w:sz w:val="24"/>
-        </w:rPr>
-        <w:t xml:space="preserve"> = .002 [−.076, .080]). Two pre-registered moderator effects were highly significant: Extraversion × Region (Asian samples </w:t>
-      </w:r>
-      <w:r>
-        <w:rPr>
-          <w:rFonts w:ascii="Times New Roman" w:hAnsi="Times New Roman" w:eastAsia="Times New Roman"/>
-          <w:i/>
-          <w:sz w:val="24"/>
-        </w:rPr>
-        <w:t>r</w:t>
-      </w:r>
-      <w:r>
-        <w:rPr>
-          <w:rFonts w:ascii="Times New Roman" w:hAnsi="Times New Roman" w:eastAsia="Times New Roman"/>
-          <w:sz w:val="24"/>
-        </w:rPr>
-        <w:t xml:space="preserve"> = −.131 vs. non-Asian </w:t>
-      </w:r>
-      <w:r>
-        <w:rPr>
-          <w:rFonts w:ascii="Times New Roman" w:hAnsi="Times New Roman" w:eastAsia="Times New Roman"/>
-          <w:i/>
-          <w:sz w:val="24"/>
-        </w:rPr>
-        <w:t>r</w:t>
-      </w:r>
-      <w:r>
-        <w:rPr>
-          <w:rFonts w:ascii="Times New Roman" w:hAnsi="Times New Roman" w:eastAsia="Times New Roman"/>
-          <w:sz w:val="24"/>
-        </w:rPr>
-        <w:t xml:space="preserve"> = .050; </w:t>
-      </w:r>
-      <w:r>
-        <w:rPr>
-          <w:rFonts w:ascii="Times New Roman" w:hAnsi="Times New Roman" w:eastAsia="Times New Roman"/>
-          <w:i/>
-          <w:sz w:val="24"/>
-        </w:rPr>
-        <w:t>Q_between</w:t>
-      </w:r>
-      <w:r>
-        <w:rPr>
-          <w:rFonts w:ascii="Times New Roman" w:hAnsi="Times New Roman" w:eastAsia="Times New Roman"/>
-          <w:sz w:val="24"/>
-        </w:rPr>
-        <w:t xml:space="preserve"> = 46.43, </w:t>
-      </w:r>
-      <w:r>
-        <w:rPr>
-          <w:rFonts w:ascii="Times New Roman" w:hAnsi="Times New Roman" w:eastAsia="Times New Roman"/>
-          <w:i/>
-          <w:sz w:val="24"/>
-        </w:rPr>
-        <w:t>p</w:t>
-      </w:r>
-      <w:r>
-        <w:rPr>
-          <w:rFonts w:ascii="Times New Roman" w:hAnsi="Times New Roman" w:eastAsia="Times New Roman"/>
-          <w:sz w:val="24"/>
-        </w:rPr>
-        <w:t xml:space="preserve"> &lt; .001) and Extraversion × Outcome Type (objective </w:t>
-      </w:r>
-      <w:r>
-        <w:rPr>
-          <w:rFonts w:ascii="Times New Roman" w:hAnsi="Times New Roman" w:eastAsia="Times New Roman"/>
-          <w:i/>
-          <w:sz w:val="24"/>
-        </w:rPr>
-        <w:t>r</w:t>
-      </w:r>
-      <w:r>
-        <w:rPr>
-          <w:rFonts w:ascii="Times New Roman" w:hAnsi="Times New Roman" w:eastAsia="Times New Roman"/>
-          <w:sz w:val="24"/>
-        </w:rPr>
-        <w:t xml:space="preserve"> = −.038 vs. self-rated </w:t>
-      </w:r>
-      <w:r>
-        <w:rPr>
-          <w:rFonts w:ascii="Times New Roman" w:hAnsi="Times New Roman" w:eastAsia="Times New Roman"/>
-          <w:i/>
-          <w:sz w:val="24"/>
-        </w:rPr>
-        <w:t>r</w:t>
-      </w:r>
-      <w:r>
-        <w:rPr>
-          <w:rFonts w:ascii="Times New Roman" w:hAnsi="Times New Roman" w:eastAsia="Times New Roman"/>
-          <w:sz w:val="24"/>
-        </w:rPr>
-        <w:t xml:space="preserve"> = .117; </w:t>
-      </w:r>
-      <w:r>
-        <w:rPr>
-          <w:rFonts w:ascii="Times New Roman" w:hAnsi="Times New Roman" w:eastAsia="Times New Roman"/>
-          <w:i/>
-          <w:sz w:val="24"/>
-        </w:rPr>
-        <w:t>Q_between</w:t>
-      </w:r>
-      <w:r>
-        <w:rPr>
-          <w:rFonts w:ascii="Times New Roman" w:hAnsi="Times New Roman" w:eastAsia="Times New Roman"/>
-          <w:sz w:val="24"/>
-        </w:rPr>
-        <w:t xml:space="preserve"> = 17.30, </w:t>
-      </w:r>
-      <w:r>
-        <w:rPr>
-          <w:rFonts w:ascii="Times New Roman" w:hAnsi="Times New Roman" w:eastAsia="Times New Roman"/>
-          <w:i/>
-          <w:sz w:val="24"/>
-        </w:rPr>
-        <w:t>p</w:t>
-      </w:r>
-      <w:r>
-        <w:rPr>
-          <w:rFonts w:ascii="Times New Roman" w:hAnsi="Times New Roman" w:eastAsia="Times New Roman"/>
-          <w:sz w:val="24"/>
-        </w:rPr>
-        <w:t xml:space="preserve"> &lt; .001). The findings provide preliminary support for the Personality-Achievement Saturation Hypothesis (PASH) extended to technology-mediated learning and document novel cultural- and outcome-type-dependent shifts in the Extraversion-achievement association. Confidence in pooled estimates (GRADE) ranged from Moderate (Conscientiousness, Extraversion) to Low (Openness, Agreeableness, Neuroticism). Limitations include the modest </w:t>
-      </w:r>
-      <w:r>
-        <w:rPr>
-          <w:rFonts w:ascii="Times New Roman" w:hAnsi="Times New Roman" w:eastAsia="Times New Roman"/>
-          <w:i/>
-          <w:sz w:val="24"/>
-        </w:rPr>
-        <w:t>k</w:t>
-      </w:r>
-      <w:r>
-        <w:rPr>
-          <w:rFonts w:ascii="Times New Roman" w:hAnsi="Times New Roman" w:eastAsia="Times New Roman"/>
-          <w:sz w:val="24"/>
-        </w:rPr>
-        <w:t xml:space="preserve"> (9–10 studies per trait) and the use of web-based rather than institutionally-licensed database searches. Online learning environments modify, but do not fundamentally transform, the well-established personality-achievement pattern; the most theoretically important divergences concern Extraversion and are structured by cultural context and outcome methodology.</w:t>
+        <w:t>A preprint version of this manuscript has been deposited on Research Square (https://doi.org/[TO BE FILLED AFTER PREPRINT DOI IS ASSIGNED]). This preprint has not been peer-reviewed by a journal. Any substantive revisions introduced during peer review are reflected in the present journal version and in a versioned preprint update.</w:t>
       </w:r>
     </w:p>
     <w:p>
@@ -673,9 +407,310 @@
       <w:r>
         <w:rPr>
           <w:rFonts w:ascii="Times New Roman" w:hAnsi="Times New Roman" w:eastAsia="Times New Roman"/>
-          <w:sz w:val="24"/>
-        </w:rPr>
-        <w:t>Keywords: Big Five; Five-Factor Model; HEXACO; online learning; e-learning; MOOC; academic achievement; meta-analysis; systematic review; PRISMA</w:t>
+          <w:b/>
+          <w:sz w:val="24"/>
+        </w:rPr>
+        <w:t>Acknowledgments</w:t>
+      </w:r>
+    </w:p>
+    <w:p>
+      <w:pPr>
+        <w:spacing w:line="480" w:lineRule="auto" w:before="0" w:after="0"/>
+      </w:pPr>
+      <w:r>
+        <w:rPr>
+          <w:rFonts w:ascii="Times New Roman" w:hAnsi="Times New Roman" w:eastAsia="Times New Roman"/>
+          <w:sz w:val="24"/>
+        </w:rPr>
+        <w:t>The author thanks the investigators of the included primary studies for making their correlation matrices and sample characteristics available in the published record, and the maintainers of the open-access repositories (OSF, Research Square, PsyArXiv, arXiv, and institutional repositories) that enabled retrieval of full-text articles. The author also acknowledges the developers of the open-source scientific Python stack (NumPy, SciPy, pandas, Matplotlib, statsmodels, and python-docx) on which the analyses and manuscript preparation depended. No funding bodies, research assistants, or third-party organizations contributed to the design, conduct, or reporting of this review.</w:t>
+      </w:r>
+    </w:p>
+    <w:p>
+      <w:pPr>
+        <w:spacing w:line="480" w:lineRule="auto" w:before="0" w:after="0"/>
+      </w:pPr>
+    </w:p>
+    <w:p>
+      <w:r>
+        <w:br w:type="page"/>
+      </w:r>
+    </w:p>
+    <w:p>
+      <w:pPr>
+        <w:pStyle w:val="Heading1"/>
+        <w:spacing w:line="480" w:lineRule="auto" w:before="0" w:after="0"/>
+      </w:pPr>
+      <w:r>
+        <w:t>Abstract</w:t>
+      </w:r>
+    </w:p>
+    <w:p>
+      <w:pPr>
+        <w:spacing w:line="480" w:lineRule="auto" w:before="0" w:after="0"/>
+      </w:pPr>
+      <w:r>
+        <w:rPr>
+          <w:rFonts w:ascii="Times New Roman" w:hAnsi="Times New Roman" w:eastAsia="Times New Roman"/>
+          <w:sz w:val="24"/>
+        </w:rPr>
+        <w:t xml:space="preserve">Existing meta-analyses of Big Five personality traits and academic achievement have pooled face-to-face, blended, and online samples without testing delivery mode as a moderator. This pre-registered systematic review and meta-analysis is the first quantitative synthesis dedicated to online learning environments. Following PRISMA 2020 standards, 31 primary studies reporting Big Five (or HEXACO) personality and academic achievement in online, blended, or MOOC environments were synthesized. Ten studies (pooled </w:t>
+      </w:r>
+      <w:r>
+        <w:rPr>
+          <w:rFonts w:ascii="Times New Roman" w:hAnsi="Times New Roman" w:eastAsia="Times New Roman"/>
+          <w:i/>
+          <w:sz w:val="24"/>
+        </w:rPr>
+        <w:t>N</w:t>
+      </w:r>
+      <w:r>
+        <w:rPr>
+          <w:rFonts w:ascii="Times New Roman" w:hAnsi="Times New Roman" w:eastAsia="Times New Roman"/>
+          <w:sz w:val="24"/>
+        </w:rPr>
+        <w:t xml:space="preserve"> = 3,384) contributed direct Pearson correlations to the primary achievement pool, analysed with random-effects meta-analysis using Hartung-Knapp-Sidik-Jonkman adjustment on the Fisher </w:t>
+      </w:r>
+      <w:r>
+        <w:rPr>
+          <w:rFonts w:ascii="Times New Roman" w:hAnsi="Times New Roman" w:eastAsia="Times New Roman"/>
+          <w:i/>
+          <w:sz w:val="24"/>
+        </w:rPr>
+        <w:t>z</w:t>
+      </w:r>
+      <w:r>
+        <w:rPr>
+          <w:rFonts w:ascii="Times New Roman" w:hAnsi="Times New Roman" w:eastAsia="Times New Roman"/>
+          <w:sz w:val="24"/>
+        </w:rPr>
+        <w:t xml:space="preserve"> scale. Conscientiousness was the strongest predictor (pooled </w:t>
+      </w:r>
+      <w:r>
+        <w:rPr>
+          <w:rFonts w:ascii="Times New Roman" w:hAnsi="Times New Roman" w:eastAsia="Times New Roman"/>
+          <w:i/>
+          <w:sz w:val="24"/>
+        </w:rPr>
+        <w:t>r</w:t>
+      </w:r>
+      <w:r>
+        <w:rPr>
+          <w:rFonts w:ascii="Times New Roman" w:hAnsi="Times New Roman" w:eastAsia="Times New Roman"/>
+          <w:sz w:val="24"/>
+        </w:rPr>
+        <w:t xml:space="preserve"> = .167, 95% CI [.089, .243]; </w:t>
+      </w:r>
+      <w:r>
+        <w:rPr>
+          <w:rFonts w:ascii="Times New Roman" w:hAnsi="Times New Roman" w:eastAsia="Times New Roman"/>
+          <w:i/>
+          <w:sz w:val="24"/>
+        </w:rPr>
+        <w:t>I²</w:t>
+      </w:r>
+      <w:r>
+        <w:rPr>
+          <w:rFonts w:ascii="Times New Roman" w:hAnsi="Times New Roman" w:eastAsia="Times New Roman"/>
+          <w:sz w:val="24"/>
+        </w:rPr>
+        <w:t xml:space="preserve"> = 65.1%), followed by Agreeableness (</w:t>
+      </w:r>
+      <w:r>
+        <w:rPr>
+          <w:rFonts w:ascii="Times New Roman" w:hAnsi="Times New Roman" w:eastAsia="Times New Roman"/>
+          <w:i/>
+          <w:sz w:val="24"/>
+        </w:rPr>
+        <w:t>r</w:t>
+      </w:r>
+      <w:r>
+        <w:rPr>
+          <w:rFonts w:ascii="Times New Roman" w:hAnsi="Times New Roman" w:eastAsia="Times New Roman"/>
+          <w:sz w:val="24"/>
+        </w:rPr>
+        <w:t xml:space="preserve"> = .112 [−.031, .250]), Openness (</w:t>
+      </w:r>
+      <w:r>
+        <w:rPr>
+          <w:rFonts w:ascii="Times New Roman" w:hAnsi="Times New Roman" w:eastAsia="Times New Roman"/>
+          <w:i/>
+          <w:sz w:val="24"/>
+        </w:rPr>
+        <w:t>r</w:t>
+      </w:r>
+      <w:r>
+        <w:rPr>
+          <w:rFonts w:ascii="Times New Roman" w:hAnsi="Times New Roman" w:eastAsia="Times New Roman"/>
+          <w:sz w:val="24"/>
+        </w:rPr>
+        <w:t xml:space="preserve"> = .086 [−.044, .214]), Neuroticism (</w:t>
+      </w:r>
+      <w:r>
+        <w:rPr>
+          <w:rFonts w:ascii="Times New Roman" w:hAnsi="Times New Roman" w:eastAsia="Times New Roman"/>
+          <w:i/>
+          <w:sz w:val="24"/>
+        </w:rPr>
+        <w:t>r</w:t>
+      </w:r>
+      <w:r>
+        <w:rPr>
+          <w:rFonts w:ascii="Times New Roman" w:hAnsi="Times New Roman" w:eastAsia="Times New Roman"/>
+          <w:sz w:val="24"/>
+        </w:rPr>
+        <w:t xml:space="preserve"> = .018), and Extraversion (</w:t>
+      </w:r>
+      <w:r>
+        <w:rPr>
+          <w:rFonts w:ascii="Times New Roman" w:hAnsi="Times New Roman" w:eastAsia="Times New Roman"/>
+          <w:i/>
+          <w:sz w:val="24"/>
+        </w:rPr>
+        <w:t>r</w:t>
+      </w:r>
+      <w:r>
+        <w:rPr>
+          <w:rFonts w:ascii="Times New Roman" w:hAnsi="Times New Roman" w:eastAsia="Times New Roman"/>
+          <w:sz w:val="24"/>
+        </w:rPr>
+        <w:t xml:space="preserve"> = .002). Two pre-registered moderator effects were highly significant: Extraversion × Region (Asian samples </w:t>
+      </w:r>
+      <w:r>
+        <w:rPr>
+          <w:rFonts w:ascii="Times New Roman" w:hAnsi="Times New Roman" w:eastAsia="Times New Roman"/>
+          <w:i/>
+          <w:sz w:val="24"/>
+        </w:rPr>
+        <w:t>r</w:t>
+      </w:r>
+      <w:r>
+        <w:rPr>
+          <w:rFonts w:ascii="Times New Roman" w:hAnsi="Times New Roman" w:eastAsia="Times New Roman"/>
+          <w:sz w:val="24"/>
+        </w:rPr>
+        <w:t xml:space="preserve"> = −.131 vs. non-Asian </w:t>
+      </w:r>
+      <w:r>
+        <w:rPr>
+          <w:rFonts w:ascii="Times New Roman" w:hAnsi="Times New Roman" w:eastAsia="Times New Roman"/>
+          <w:i/>
+          <w:sz w:val="24"/>
+        </w:rPr>
+        <w:t>r</w:t>
+      </w:r>
+      <w:r>
+        <w:rPr>
+          <w:rFonts w:ascii="Times New Roman" w:hAnsi="Times New Roman" w:eastAsia="Times New Roman"/>
+          <w:sz w:val="24"/>
+        </w:rPr>
+        <w:t xml:space="preserve"> = .050; </w:t>
+      </w:r>
+      <w:r>
+        <w:rPr>
+          <w:rFonts w:ascii="Times New Roman" w:hAnsi="Times New Roman" w:eastAsia="Times New Roman"/>
+          <w:i/>
+          <w:sz w:val="24"/>
+        </w:rPr>
+        <w:t>Q_between</w:t>
+      </w:r>
+      <w:r>
+        <w:rPr>
+          <w:rFonts w:ascii="Times New Roman" w:hAnsi="Times New Roman" w:eastAsia="Times New Roman"/>
+          <w:sz w:val="24"/>
+        </w:rPr>
+        <w:t xml:space="preserve"> = 46.43, </w:t>
+      </w:r>
+      <w:r>
+        <w:rPr>
+          <w:rFonts w:ascii="Times New Roman" w:hAnsi="Times New Roman" w:eastAsia="Times New Roman"/>
+          <w:i/>
+          <w:sz w:val="24"/>
+        </w:rPr>
+        <w:t>p</w:t>
+      </w:r>
+      <w:r>
+        <w:rPr>
+          <w:rFonts w:ascii="Times New Roman" w:hAnsi="Times New Roman" w:eastAsia="Times New Roman"/>
+          <w:sz w:val="24"/>
+        </w:rPr>
+        <w:t xml:space="preserve"> &lt; .001) and Extraversion × Outcome Type (objective </w:t>
+      </w:r>
+      <w:r>
+        <w:rPr>
+          <w:rFonts w:ascii="Times New Roman" w:hAnsi="Times New Roman" w:eastAsia="Times New Roman"/>
+          <w:i/>
+          <w:sz w:val="24"/>
+        </w:rPr>
+        <w:t>r</w:t>
+      </w:r>
+      <w:r>
+        <w:rPr>
+          <w:rFonts w:ascii="Times New Roman" w:hAnsi="Times New Roman" w:eastAsia="Times New Roman"/>
+          <w:sz w:val="24"/>
+        </w:rPr>
+        <w:t xml:space="preserve"> = −.038 vs. self-rated </w:t>
+      </w:r>
+      <w:r>
+        <w:rPr>
+          <w:rFonts w:ascii="Times New Roman" w:hAnsi="Times New Roman" w:eastAsia="Times New Roman"/>
+          <w:i/>
+          <w:sz w:val="24"/>
+        </w:rPr>
+        <w:t>r</w:t>
+      </w:r>
+      <w:r>
+        <w:rPr>
+          <w:rFonts w:ascii="Times New Roman" w:hAnsi="Times New Roman" w:eastAsia="Times New Roman"/>
+          <w:sz w:val="24"/>
+        </w:rPr>
+        <w:t xml:space="preserve"> = .117; </w:t>
+      </w:r>
+      <w:r>
+        <w:rPr>
+          <w:rFonts w:ascii="Times New Roman" w:hAnsi="Times New Roman" w:eastAsia="Times New Roman"/>
+          <w:i/>
+          <w:sz w:val="24"/>
+        </w:rPr>
+        <w:t>Q_between</w:t>
+      </w:r>
+      <w:r>
+        <w:rPr>
+          <w:rFonts w:ascii="Times New Roman" w:hAnsi="Times New Roman" w:eastAsia="Times New Roman"/>
+          <w:sz w:val="24"/>
+        </w:rPr>
+        <w:t xml:space="preserve"> = 17.30, </w:t>
+      </w:r>
+      <w:r>
+        <w:rPr>
+          <w:rFonts w:ascii="Times New Roman" w:hAnsi="Times New Roman" w:eastAsia="Times New Roman"/>
+          <w:i/>
+          <w:sz w:val="24"/>
+        </w:rPr>
+        <w:t>p</w:t>
+      </w:r>
+      <w:r>
+        <w:rPr>
+          <w:rFonts w:ascii="Times New Roman" w:hAnsi="Times New Roman" w:eastAsia="Times New Roman"/>
+          <w:sz w:val="24"/>
+        </w:rPr>
+        <w:t xml:space="preserve"> &lt; .001). Findings provide preliminary support for the Personality-Achievement Saturation Hypothesis extended to technology-mediated learning and document novel cultural- and outcome-type-dependent shifts in the Extraversion-achievement link. GRADE confidence ranged from Moderate (Conscientiousness, Extraversion) to Low (Openness, Agreeableness, Neuroticism). Online learning modifies, but does not fundamentally transform, the established personality-achievement pattern; the most theoretically important divergences concern Extraversion and are structured by cultural context and outcome methodology.</w:t>
+      </w:r>
+    </w:p>
+    <w:p>
+      <w:pPr>
+        <w:spacing w:line="480" w:lineRule="auto" w:before="0" w:after="0"/>
+      </w:pPr>
+    </w:p>
+    <w:p>
+      <w:pPr>
+        <w:spacing w:line="480" w:lineRule="auto" w:before="0" w:after="0"/>
+      </w:pPr>
+      <w:r>
+        <w:rPr>
+          <w:rFonts w:ascii="Times New Roman" w:hAnsi="Times New Roman" w:eastAsia="Times New Roman"/>
+          <w:sz w:val="24"/>
+        </w:rPr>
+        <w:t>Keywords: Big Five, Five-Factor Model, HEXACO, online learning, e-learning, MOOC, academic achievement, meta-analysis, systematic review, PRISMA</w:t>
       </w:r>
     </w:p>
     <w:p>

</xml_diff>

<commit_message>
Remove HEXACO from abstract and keywords (no HEXACO study in primary pool)
The protocol allowed HEXACO inventories, but only one HEXACO study (A-19
MacLean 2022, MSc thesis) was identified, and it was excluded from the
primary pool (preference outcome, not academic achievement). All 10 studies
contributing to the primary 31-study synthesis pool used Big Five
instruments, so the prior wording "Big Five (or HEXACO)" and "HEXACO" in
keywords overstated framework coverage.

- build_docx.py: drop "(or HEXACO)" from abstract body and "HEXACO" from keywords
- introduction.md: drop HEXACO from keywords line
- Regenerate manuscript_preprint.docx, manuscript_journal.docx, and split/*.docx

Note: manuscript_preprint_ja.docx (Japanese translation) is not regenerated
by build_docx.py and is left untouched here.
</commit_message>
<xml_diff>
--- a/metaanalysis/paper/manuscript_journal.docx
+++ b/metaanalysis/paper/manuscript_journal.docx
@@ -453,7 +453,7 @@
           <w:rFonts w:ascii="Times New Roman" w:hAnsi="Times New Roman" w:eastAsia="Times New Roman"/>
           <w:sz w:val="24"/>
         </w:rPr>
-        <w:t xml:space="preserve">Existing meta-analyses of Big Five personality traits and academic achievement have pooled face-to-face, blended, and online samples without testing delivery mode as a moderator. This pre-registered systematic review and meta-analysis is the first quantitative synthesis dedicated to online learning environments. Following PRISMA 2020 standards, 31 primary studies reporting Big Five (or HEXACO) personality and academic achievement in online, blended, or MOOC environments were synthesized. Ten studies (pooled </w:t>
+        <w:t xml:space="preserve">Existing meta-analyses of Big Five personality traits and academic achievement have pooled face-to-face, blended, and online samples without testing delivery mode as a moderator. This pre-registered systematic review and meta-analysis is the first quantitative synthesis dedicated to online learning environments. Following PRISMA 2020 standards, 31 primary studies reporting Big Five personality and academic achievement in online, blended, or MOOC environments were synthesized. Ten studies (pooled </w:t>
       </w:r>
       <w:r>
         <w:rPr>
@@ -710,7 +710,7 @@
           <w:rFonts w:ascii="Times New Roman" w:hAnsi="Times New Roman" w:eastAsia="Times New Roman"/>
           <w:sz w:val="24"/>
         </w:rPr>
-        <w:t>Keywords: Big Five, Five-Factor Model, HEXACO, online learning, e-learning, MOOC, academic achievement, meta-analysis, systematic review, PRISMA</w:t>
+        <w:t>Keywords: Big Five, Five-Factor Model, online learning, e-learning, MOOC, academic achievement, meta-analysis, systematic review, PRISMA</w:t>
       </w:r>
     </w:p>
     <w:p>

</xml_diff>

<commit_message>
Remove HEXACO from abstract and keywords (no HEXACO study in primary pool) (#4)
The protocol allowed HEXACO inventories, but only one HEXACO study (A-19
MacLean 2022, MSc thesis) was identified, and it was excluded from the
primary pool (preference outcome, not academic achievement). All 10 studies
contributing to the primary 31-study synthesis pool used Big Five
instruments, so the prior wording "Big Five (or HEXACO)" and "HEXACO" in
keywords overstated framework coverage.

- build_docx.py: drop "(or HEXACO)" from abstract body and "HEXACO" from keywords
- introduction.md: drop HEXACO from keywords line
- Regenerate manuscript_preprint.docx, manuscript_journal.docx, and split/*.docx

Note: manuscript_preprint_ja.docx (Japanese translation) is not regenerated
by build_docx.py and is left untouched here.

Co-authored-by: Claude <noreply@anthropic.com>
</commit_message>
<xml_diff>
--- a/metaanalysis/paper/manuscript_journal.docx
+++ b/metaanalysis/paper/manuscript_journal.docx
@@ -453,7 +453,7 @@
           <w:rFonts w:ascii="Times New Roman" w:hAnsi="Times New Roman" w:eastAsia="Times New Roman"/>
           <w:sz w:val="24"/>
         </w:rPr>
-        <w:t xml:space="preserve">Existing meta-analyses of Big Five personality traits and academic achievement have pooled face-to-face, blended, and online samples without testing delivery mode as a moderator. This pre-registered systematic review and meta-analysis is the first quantitative synthesis dedicated to online learning environments. Following PRISMA 2020 standards, 31 primary studies reporting Big Five (or HEXACO) personality and academic achievement in online, blended, or MOOC environments were synthesized. Ten studies (pooled </w:t>
+        <w:t xml:space="preserve">Existing meta-analyses of Big Five personality traits and academic achievement have pooled face-to-face, blended, and online samples without testing delivery mode as a moderator. This pre-registered systematic review and meta-analysis is the first quantitative synthesis dedicated to online learning environments. Following PRISMA 2020 standards, 31 primary studies reporting Big Five personality and academic achievement in online, blended, or MOOC environments were synthesized. Ten studies (pooled </w:t>
       </w:r>
       <w:r>
         <w:rPr>
@@ -710,7 +710,7 @@
           <w:rFonts w:ascii="Times New Roman" w:hAnsi="Times New Roman" w:eastAsia="Times New Roman"/>
           <w:sz w:val="24"/>
         </w:rPr>
-        <w:t>Keywords: Big Five, Five-Factor Model, HEXACO, online learning, e-learning, MOOC, academic achievement, meta-analysis, systematic review, PRISMA</w:t>
+        <w:t>Keywords: Big Five, Five-Factor Model, online learning, e-learning, MOOC, academic achievement, meta-analysis, systematic review, PRISMA</w:t>
       </w:r>
     </w:p>
     <w:p>

</xml_diff>

<commit_message>
metaanalysis: strict hallucination check on paper
引用検証で発見された不整合・欠落・ハルシネーションを修正:

1. 引用されているが REFERENCES に欠落していた 17 件を追補
   (Audet 2021/2023, Baruth & Cohen 2023, Bhattacharjee & Ramkumar 2025,
   Boonyapison 2025, Cohen & Baruth 2017, Eilam 2009, Elvers 2003,
   Hidalgo-Fuentes 2024, Kaspar 2023, MacLean 2022, Mustafa 2022,
   Paulhus 1998, Quigley 2022, Sahinidis & Tsaknis 2021, Tlili 2023,
   Zheng & Zheng 2023)

2. 年次表記誤り修正: "Baruth & Cohen 2022/2023" → "Baruth & Cohen 2023"

3. ハルシネーション除去: Mustafa 2022 は exclude_from_primary であり
   β-converted 寄与研究リストに含めるのは誤り

4. 教育レベル集計の不整合修正: A-10 (Boonyapison) は face-to-face
   除外であるため K-12 included list から削除 (3 studies → 2 studies)

5. PRISMA caption の算術不整合修正: "Seven reports were excluded" →
   "Eleven reports" (5+4+1+1=11); non-Big-Five count を 7→5 に整合

6. 検証不能引用の削除: "Jackson et al. 2010"

7. Methods deviations の log-sample size 閾値 (N > 500) を
   "larger studies" に再表現し、Alkis N=316 → 189 (analytic) に修正
</commit_message>
<xml_diff>
--- a/metaanalysis/paper/manuscript_journal.docx
+++ b/metaanalysis/paper/manuscript_journal.docx
@@ -2973,7 +2973,7 @@
           <w:rFonts w:ascii="Times New Roman" w:hAnsi="Times New Roman" w:eastAsia="Times New Roman"/>
           <w:sz w:val="24"/>
         </w:rPr>
-        <w:t xml:space="preserve"> = .144 in Rivers, 2021), and β-converted studies. Consistent with McAbee and Oswald (2013), the short-form Mini-IPIP and TIPI produced the smallest magnitudes, but the k-per-instrument was insufficient for inferential testing. (b) Publication year: the eligible studies spanned 2003 to 2025, with concentration in 2020–2023. A scatter-plot inspection of year vs. effect size (not reported) indicated no systematic trend. (c) Log-sample size: studies with </w:t>
+        <w:t xml:space="preserve"> = .144 in Rivers, 2021), and β-converted studies. Consistent with McAbee and Oswald (2013), the short-form Mini-IPIP and TIPI produced the smallest magnitudes, but the k-per-instrument was insufficient for inferential testing. (b) Publication year: the eligible studies spanned 2003 to 2025, with concentration in 2020–2023. A scatter-plot inspection of year vs. effect size (not reported) indicated no systematic trend. (c) Log-sample size: larger studies (Wang 2023 </w:t>
       </w:r>
       <w:r>
         <w:rPr>
@@ -2988,7 +2988,7 @@
           <w:rFonts w:ascii="Times New Roman" w:hAnsi="Times New Roman" w:eastAsia="Times New Roman"/>
           <w:sz w:val="24"/>
         </w:rPr>
-        <w:t xml:space="preserve"> &gt; 500 (Wang 2023 </w:t>
+        <w:t xml:space="preserve"> = 1,625; Yu 2021 </w:t>
       </w:r>
       <w:r>
         <w:rPr>
@@ -3003,7 +3003,7 @@
           <w:rFonts w:ascii="Times New Roman" w:hAnsi="Times New Roman" w:eastAsia="Times New Roman"/>
           <w:sz w:val="24"/>
         </w:rPr>
-        <w:t xml:space="preserve"> = 1,625; Yu 2021 </w:t>
+        <w:t xml:space="preserve"> = 1,152; Bahçekapılı &amp; Karaman 2020 </w:t>
       </w:r>
       <w:r>
         <w:rPr>
@@ -3018,7 +3018,7 @@
           <w:rFonts w:ascii="Times New Roman" w:hAnsi="Times New Roman" w:eastAsia="Times New Roman"/>
           <w:sz w:val="24"/>
         </w:rPr>
-        <w:t xml:space="preserve"> = 1,152; Alkış &amp; Temizel 2018 </w:t>
+        <w:t xml:space="preserve"> = 525; Alkış &amp; Taşkaya Temizel 2018 online subsample </w:t>
       </w:r>
       <w:r>
         <w:rPr>
@@ -3033,7 +3033,7 @@
           <w:rFonts w:ascii="Times New Roman" w:hAnsi="Times New Roman" w:eastAsia="Times New Roman"/>
           <w:sz w:val="24"/>
         </w:rPr>
-        <w:t xml:space="preserve"> = 316 online subset; Bahçekapılı &amp; Karaman 2020 </w:t>
+        <w:t xml:space="preserve"> = 189; Kaspar et al. 2023 </w:t>
       </w:r>
       <w:r>
         <w:rPr>
@@ -3048,7 +3048,7 @@
           <w:rFonts w:ascii="Times New Roman" w:hAnsi="Times New Roman" w:eastAsia="Times New Roman"/>
           <w:sz w:val="24"/>
         </w:rPr>
-        <w:t xml:space="preserve"> = 525; Kaspar et al. 2023 </w:t>
+        <w:t xml:space="preserve"> = 413; Quigley et al. 2022 </w:t>
       </w:r>
       <w:r>
         <w:rPr>
@@ -3063,7 +3063,7 @@
           <w:rFonts w:ascii="Times New Roman" w:hAnsi="Times New Roman" w:eastAsia="Times New Roman"/>
           <w:sz w:val="24"/>
         </w:rPr>
-        <w:t xml:space="preserve"> = 413; Quigley et al. 2022 </w:t>
+        <w:t xml:space="preserve"> = 301; Rodrigues et al. 2024 </w:t>
       </w:r>
       <w:r>
         <w:rPr>
@@ -3078,7 +3078,7 @@
           <w:rFonts w:ascii="Times New Roman" w:hAnsi="Times New Roman" w:eastAsia="Times New Roman"/>
           <w:sz w:val="24"/>
         </w:rPr>
-        <w:t xml:space="preserve"> = 301; Rodrigues et al. 2024 </w:t>
+        <w:t xml:space="preserve"> = 260; Zheng &amp; Zheng 2023 </w:t>
       </w:r>
       <w:r>
         <w:rPr>
@@ -3093,7 +3093,7 @@
           <w:rFonts w:ascii="Times New Roman" w:hAnsi="Times New Roman" w:eastAsia="Times New Roman"/>
           <w:sz w:val="24"/>
         </w:rPr>
-        <w:t xml:space="preserve"> = 260; Zheng &amp; Zheng 2023 </w:t>
+        <w:t xml:space="preserve"> = 282) produced smaller pooled Conscientiousness estimates (</w:t>
       </w:r>
       <w:r>
         <w:rPr>
@@ -3101,21 +3101,6 @@
           <w:i/>
           <w:sz w:val="24"/>
         </w:rPr>
-        <w:t>N</w:t>
-      </w:r>
-      <w:r>
-        <w:rPr>
-          <w:rFonts w:ascii="Times New Roman" w:hAnsi="Times New Roman" w:eastAsia="Times New Roman"/>
-          <w:sz w:val="24"/>
-        </w:rPr>
-        <w:t xml:space="preserve"> = 282) produced smaller pooled Conscientiousness estimates (</w:t>
-      </w:r>
-      <w:r>
-        <w:rPr>
-          <w:rFonts w:ascii="Times New Roman" w:hAnsi="Times New Roman" w:eastAsia="Times New Roman"/>
-          <w:i/>
-          <w:sz w:val="24"/>
-        </w:rPr>
         <w:t>r</w:t>
       </w:r>
       <w:r>
@@ -3123,22 +3108,7 @@
           <w:rFonts w:ascii="Times New Roman" w:hAnsi="Times New Roman" w:eastAsia="Times New Roman"/>
           <w:sz w:val="24"/>
         </w:rPr>
-        <w:t xml:space="preserve"> ≈ .10) than studies with </w:t>
-      </w:r>
-      <w:r>
-        <w:rPr>
-          <w:rFonts w:ascii="Times New Roman" w:hAnsi="Times New Roman" w:eastAsia="Times New Roman"/>
-          <w:i/>
-          <w:sz w:val="24"/>
-        </w:rPr>
-        <w:t>N</w:t>
-      </w:r>
-      <w:r>
-        <w:rPr>
-          <w:rFonts w:ascii="Times New Roman" w:hAnsi="Times New Roman" w:eastAsia="Times New Roman"/>
-          <w:sz w:val="24"/>
-        </w:rPr>
-        <w:t xml:space="preserve"> &lt; 200 (</w:t>
+        <w:t xml:space="preserve"> ≈ .10) than the smallest studies in the corpus (</w:t>
       </w:r>
       <w:r>
         <w:rPr>
@@ -3206,7 +3176,7 @@
           <w:rFonts w:ascii="Times New Roman" w:hAnsi="Times New Roman" w:eastAsia="Times New Roman"/>
           <w:sz w:val="24"/>
         </w:rPr>
-        <w:t>The PRISMA 2020 flow of information through the review is summarized in Figure 1. The database searches (WebSearch-based due to the deviation described in Methods) and supplementary sources yielded approximately 80 candidate records identified through eight targeted queries, combined with 28 primary studies already obtained through preliminary searches and an additional 12 primary-study or benchmark PDFs retrieved from open-access repositories during the formal search execution. After removal of duplicates and exclusion of records obviously outside the review scope at title/abstract screening, 38 reports were assessed at the full-text stage. Of these, seven were excluded for measuring a non-Big-Five personality framework (three MBTI, two Proactive Personality, one TUE, one TAM), and four were excluded for a fully face-to-face modality. The remaining 27 primary studies met all eligibility criteria, plus four newly identified primary studies (A-29 Bahçekapılı &amp; Karaman, 2020; A-30 Kaspar et al., 2023; A-31 Rivers, 2021; A-37 Zheng &amp; Zheng, 2023) were added, for a total of 31 primary studies contributing to the quantitative synthesis.</w:t>
+        <w:t>The PRISMA 2020 flow of information through the review is summarized in Figure 1. The database searches (WebSearch-based due to the deviation described in Methods) and supplementary sources yielded approximately 80 candidate records identified through eight targeted queries, combined with 28 primary studies already obtained through preliminary searches and an additional 12 primary-study or benchmark PDFs retrieved from open-access repositories during the formal search execution. After removal of duplicates and exclusion of records obviously outside the review scope at title/abstract screening, 38 reports were assessed at the full-text stage. Of these, five were excluded for measuring a non-Big-Five personality framework (MBTI, Proactive Personality, TAM, TUE, and other non-FFM operationalization), four were excluded for a fully face-to-face modality (A-09, A-10, A-14, A-16), one was excluded for sample overlap (A-05 with A-04), and one was excluded because effect sizes were not extractable (A-24). The remaining 27 primary studies met all eligibility criteria, plus four newly identified primary studies (A-29 Bahçekapılı &amp; Karaman, 2020; A-30 Kaspar et al., 2023; A-31 Rivers, 2021; A-37 Zheng &amp; Zheng, 2023) were added, for a total of 31 primary studies contributing to the quantitative synthesis.</w:t>
       </w:r>
     </w:p>
     <w:p>
@@ -3299,7 +3269,7 @@
           <w:rFonts w:ascii="Times New Roman" w:hAnsi="Times New Roman" w:eastAsia="Times New Roman"/>
           <w:sz w:val="24"/>
         </w:rPr>
-        <w:t>The distribution of studies across learning modality was dominated by fully online modalities (27 of 31 studies), with the remainder classified as blended (A-02 has a blended subsample; reported as a separate effect size) or MOOC-specific (A-28 Yu, 2021). Within fully online, the asynchronous/synchronous distinction was explicitly reported for only 9 studies; these comprised 5 primarily asynchronous and 4 synchronous or mixed contexts. Education levels comprised K-12 (3 studies: A-10, A-25, A-26), undergraduate (22 studies), mixed undergraduate/graduate (5 studies), and graduate only (1 study: A-37 Zheng &amp; Zheng, 2023). Regional distribution, important for the pre-registered Asian-amplification moderator analysis, was as follows: Asia (13 studies; includes East Asian and Middle Eastern samples), Europe (8 studies), North America (5 studies), and Other (1 study: A-24 Tunisia). Era coding, for the era moderator, yielded 7 pre-COVID, 15 COVID-era, and 7 post-COVID or mixed-era studies; 2 studies spanned multiple eras.</w:t>
+        <w:t>The distribution of studies across learning modality was dominated by fully online modalities (27 of 31 studies), with the remainder classified as blended (A-02 has a blended subsample; reported as a separate effect size) or MOOC-specific (A-28 Yu, 2021). Within fully online, the asynchronous/synchronous distinction was explicitly reported for only 9 studies; these comprised 5 primarily asynchronous and 4 synchronous or mixed contexts. Education levels comprised K-12 (2 studies: A-25, A-26; A-10 was identified as a K-12 record but excluded as face-to-face), undergraduate (22 studies), mixed undergraduate/graduate (5 studies), and graduate only (1 study: A-37 Zheng &amp; Zheng, 2023). Regional distribution, important for the pre-registered Asian-amplification moderator analysis, was as follows: Asia (13 studies; includes East Asian and Middle Eastern samples), Europe (8 studies), North America (5 studies), and Other (1 study: A-24 Tunisia). Era coding, for the era moderator, yielded 7 pre-COVID, 15 COVID-era, and 7 post-COVID or mixed-era studies; 2 studies spanned multiple eras.</w:t>
       </w:r>
     </w:p>
     <w:p>
@@ -4081,7 +4051,7 @@
           <w:rFonts w:ascii="Times New Roman" w:hAnsi="Times New Roman" w:eastAsia="Times New Roman"/>
           <w:sz w:val="24"/>
         </w:rPr>
-        <w:t xml:space="preserve"> = .010). Primary-study signs were mixed: Rodrigues et al. (2024) and Baruth and Cohen (2022/2023) reported negative associations with satisfaction or well-being, whereas Yu (2021) reported a weakly positive association, and the β-excluded sensitivity analysis (see below) reduced the pooled </w:t>
+        <w:t xml:space="preserve"> = .010). Primary-study signs were mixed: Rodrigues et al. (2024) and Baruth and Cohen (2023) reported negative associations with satisfaction or well-being, whereas Yu (2021) reported a weakly positive association, and the β-excluded sensitivity analysis (see below) reduced the pooled </w:t>
       </w:r>
       <w:r>
         <w:rPr>
@@ -5642,7 +5612,7 @@
           <w:rFonts w:ascii="Times New Roman" w:hAnsi="Times New Roman" w:eastAsia="Times New Roman"/>
           <w:sz w:val="24"/>
         </w:rPr>
-        <w:t xml:space="preserve"> to engagement = .112) and by Israeli samples (A-12 Baruth &amp; Cohen, 2022/2023, </w:t>
+        <w:t xml:space="preserve"> to engagement = .112) and by Israeli samples (A-12 Baruth &amp; Cohen, 2023, </w:t>
       </w:r>
       <w:r>
         <w:rPr>
@@ -5805,7 +5775,7 @@
           <w:rFonts w:ascii="Times New Roman" w:hAnsi="Times New Roman" w:eastAsia="Times New Roman"/>
           <w:sz w:val="24"/>
         </w:rPr>
-        <w:t xml:space="preserve"> studies (principally Yu, 2021; Wang et al., 2023; Kaspar et al., 2023; Mustafa et al., 2022) systematically attenuate the Neuroticism effect, potentially because these studies control for multiple covariates in the </w:t>
+        <w:t xml:space="preserve"> studies (principally Yu, 2021 and Kaspar et al., 2023) systematically attenuate the Neuroticism effect, potentially because these studies control for multiple covariates in the </w:t>
       </w:r>
       <w:r>
         <w:rPr>
@@ -6466,7 +6436,7 @@
           <w:rFonts w:ascii="Times New Roman" w:hAnsi="Times New Roman" w:eastAsia="Times New Roman"/>
           <w:sz w:val="24"/>
         </w:rPr>
-        <w:t xml:space="preserve"> = [k_achievement_direct]) was at the lower bound of what is generally considered adequate for robust random-effects estimation (Borenstein et al., 2021; Jackson et al., 2010). Although the pre-specified moderator analyses were designed under the assumption of a larger corpus, the effective </w:t>
+        <w:t xml:space="preserve"> = [k_achievement_direct]) was at the lower bound of what is generally considered adequate for robust random-effects estimation (Borenstein et al., 2021). Although the pre-specified moderator analyses were designed under the assumption of a larger corpus, the effective </w:t>
       </w:r>
       <w:r>
         <w:rPr>
@@ -6726,7 +6696,7 @@
           <w:rFonts w:ascii="Times New Roman" w:hAnsi="Times New Roman" w:eastAsia="Times New Roman"/>
           <w:sz w:val="24"/>
         </w:rPr>
-        <w:t xml:space="preserve">Bahçekapılı, E., &amp; Karaman, S. (2020). A path analysis of five-factor personality traits, self-efficacy, academic locus of control and academic achievement among online students. </w:t>
+        <w:t xml:space="preserve">Audet, É. C., Levine, S. L., Metin, E., Koestner, S., &amp; Barcan, S. (2021). Zooming their way through university: Which Big 5 traits facilitated students' adjustment to online courses during the COVID-19 pandemic. </w:t>
       </w:r>
       <w:r>
         <w:rPr>
@@ -6734,14 +6704,14 @@
           <w:i/>
           <w:sz w:val="24"/>
         </w:rPr>
-        <w:t>Knowledge Management &amp; E-Learning, 12</w:t>
-      </w:r>
-      <w:r>
-        <w:rPr>
-          <w:rFonts w:ascii="Times New Roman" w:hAnsi="Times New Roman" w:eastAsia="Times New Roman"/>
-          <w:sz w:val="24"/>
-        </w:rPr>
-        <w:t>(2), 191–208. https://doi.org/10.34105/j.kmel.2020.12.010</w:t>
+        <w:t>Personality and Individual Differences, 180</w:t>
+      </w:r>
+      <w:r>
+        <w:rPr>
+          <w:rFonts w:ascii="Times New Roman" w:hAnsi="Times New Roman" w:eastAsia="Times New Roman"/>
+          <w:sz w:val="24"/>
+        </w:rPr>
+        <w:t>, 110969. https://doi.org/10.1016/j.paid.2021.110969</w:t>
       </w:r>
     </w:p>
     <w:p>
@@ -6754,7 +6724,7 @@
           <w:rFonts w:ascii="Times New Roman" w:hAnsi="Times New Roman" w:eastAsia="Times New Roman"/>
           <w:sz w:val="24"/>
         </w:rPr>
-        <w:t xml:space="preserve">Borenstein, </w:t>
+        <w:t xml:space="preserve">Audet, É. C., Levine, S. L., Dubois, P., Koestner, S., &amp; Koestner, R. (2023). The unanticipated virtual year: How the Big 5 personality traits of openness to experience and conscientiousness impacted engagement in online classes during the COVID-19 crisis. </w:t>
       </w:r>
       <w:r>
         <w:rPr>
@@ -6762,14 +6732,14 @@
           <w:i/>
           <w:sz w:val="24"/>
         </w:rPr>
-        <w:t>M</w:t>
-      </w:r>
-      <w:r>
-        <w:rPr>
-          <w:rFonts w:ascii="Times New Roman" w:hAnsi="Times New Roman" w:eastAsia="Times New Roman"/>
-          <w:sz w:val="24"/>
-        </w:rPr>
-        <w:t>., Hedges, L. V., Higgins, J. P. T., &amp; Rothstein, H. R. (2009). Introduction to meta-analysis. John Wiley &amp; Sons.</w:t>
+        <w:t>Journal of College Reading and Learning, 53</w:t>
+      </w:r>
+      <w:r>
+        <w:rPr>
+          <w:rFonts w:ascii="Times New Roman" w:hAnsi="Times New Roman" w:eastAsia="Times New Roman"/>
+          <w:sz w:val="24"/>
+        </w:rPr>
+        <w:t>(4), 298–315. https://doi.org/10.1080/10790195.2023.2250402</w:t>
       </w:r>
     </w:p>
     <w:p>
@@ -6782,7 +6752,7 @@
           <w:rFonts w:ascii="Times New Roman" w:hAnsi="Times New Roman" w:eastAsia="Times New Roman"/>
           <w:sz w:val="24"/>
         </w:rPr>
-        <w:t xml:space="preserve">Borenstein, </w:t>
+        <w:t xml:space="preserve">Bahçekapılı, E., &amp; Karaman, S. (2020). A path analysis of five-factor personality traits, self-efficacy, academic locus of control and academic achievement among online students. </w:t>
       </w:r>
       <w:r>
         <w:rPr>
@@ -6790,14 +6760,14 @@
           <w:i/>
           <w:sz w:val="24"/>
         </w:rPr>
-        <w:t>M</w:t>
-      </w:r>
-      <w:r>
-        <w:rPr>
-          <w:rFonts w:ascii="Times New Roman" w:hAnsi="Times New Roman" w:eastAsia="Times New Roman"/>
-          <w:sz w:val="24"/>
-        </w:rPr>
-        <w:t>., Hedges, L. V., Higgins, J. P. T., &amp; Rothstein, H. R. (2021). Introduction to meta-analysis (2nd ed.). John Wiley &amp; Sons.</w:t>
+        <w:t>Knowledge Management &amp; E-Learning, 12</w:t>
+      </w:r>
+      <w:r>
+        <w:rPr>
+          <w:rFonts w:ascii="Times New Roman" w:hAnsi="Times New Roman" w:eastAsia="Times New Roman"/>
+          <w:sz w:val="24"/>
+        </w:rPr>
+        <w:t>(2), 191–208. https://doi.org/10.34105/j.kmel.2020.12.010</w:t>
       </w:r>
     </w:p>
     <w:p>
@@ -6810,7 +6780,7 @@
           <w:rFonts w:ascii="Times New Roman" w:hAnsi="Times New Roman" w:eastAsia="Times New Roman"/>
           <w:sz w:val="24"/>
         </w:rPr>
-        <w:t xml:space="preserve">Broadbent, J., &amp; Poon, W. L. (2015). Self-regulated learning strategies &amp; academic achievement in online higher education learning environments: A systematic review. </w:t>
+        <w:t xml:space="preserve">Baruth, O., &amp; Cohen, A. (2023). Personality and satisfaction with online courses: The relation between the Big Five personality traits and satisfaction with online learning activities. </w:t>
       </w:r>
       <w:r>
         <w:rPr>
@@ -6818,14 +6788,14 @@
           <w:i/>
           <w:sz w:val="24"/>
         </w:rPr>
-        <w:t>The Internet and Higher Education, 27</w:t>
-      </w:r>
-      <w:r>
-        <w:rPr>
-          <w:rFonts w:ascii="Times New Roman" w:hAnsi="Times New Roman" w:eastAsia="Times New Roman"/>
-          <w:sz w:val="24"/>
-        </w:rPr>
-        <w:t>, 1–13. https://doi.org/10.1016/j.iheduc.2015.04.007</w:t>
+        <w:t>Education and Information Technologies, 28</w:t>
+      </w:r>
+      <w:r>
+        <w:rPr>
+          <w:rFonts w:ascii="Times New Roman" w:hAnsi="Times New Roman" w:eastAsia="Times New Roman"/>
+          <w:sz w:val="24"/>
+        </w:rPr>
+        <w:t>, 879–904. https://doi.org/10.1007/s10639-022-11199-x</w:t>
       </w:r>
     </w:p>
     <w:p>
@@ -6838,7 +6808,7 @@
           <w:rFonts w:ascii="Times New Roman" w:hAnsi="Times New Roman" w:eastAsia="Times New Roman"/>
           <w:sz w:val="24"/>
         </w:rPr>
-        <w:t xml:space="preserve">Chen, S., Cheung, A. C. K., &amp; Zeng, Z. (2025). Big Five personality traits and university students' academic performance: A meta-analysis. </w:t>
+        <w:t xml:space="preserve">Bhattacharjee, R. R., &amp; Ramkumar, A. (2025). Effect of big five personality dimensions on the academic performance of college students. </w:t>
       </w:r>
       <w:r>
         <w:rPr>
@@ -6846,14 +6816,14 @@
           <w:i/>
           <w:sz w:val="24"/>
         </w:rPr>
-        <w:t>Personality and Individual Differences, 240</w:t>
-      </w:r>
-      <w:r>
-        <w:rPr>
-          <w:rFonts w:ascii="Times New Roman" w:hAnsi="Times New Roman" w:eastAsia="Times New Roman"/>
-          <w:sz w:val="24"/>
-        </w:rPr>
-        <w:t>, 113163. https://doi.org/10.1016/j.paid.2025.113163</w:t>
+        <w:t>Frontiers in Psychology, 16</w:t>
+      </w:r>
+      <w:r>
+        <w:rPr>
+          <w:rFonts w:ascii="Times New Roman" w:hAnsi="Times New Roman" w:eastAsia="Times New Roman"/>
+          <w:sz w:val="24"/>
+        </w:rPr>
+        <w:t>, 1490427. https://doi.org/10.3389/fpsyg.2025.1490427</w:t>
       </w:r>
     </w:p>
     <w:p>
@@ -6866,7 +6836,7 @@
           <w:rFonts w:ascii="Times New Roman" w:hAnsi="Times New Roman" w:eastAsia="Times New Roman"/>
           <w:sz w:val="24"/>
         </w:rPr>
-        <w:t xml:space="preserve">Cheng, S.-L., Chang, J.-C., Quilantan-Garza, K., &amp; Gutierrez, </w:t>
+        <w:t xml:space="preserve">Boonyapison, K., Sittironnarit, G., &amp; Rattanaumpawan, P. (2025). Association between the big five personalities and academic performance among grade 12 students at international high school in Thailand. </w:t>
       </w:r>
       <w:r>
         <w:rPr>
@@ -6874,14 +6844,14 @@
           <w:i/>
           <w:sz w:val="24"/>
         </w:rPr>
-        <w:t>M</w:t>
-      </w:r>
-      <w:r>
-        <w:rPr>
-          <w:rFonts w:ascii="Times New Roman" w:hAnsi="Times New Roman" w:eastAsia="Times New Roman"/>
-          <w:sz w:val="24"/>
-        </w:rPr>
-        <w:t>. L. (2023). Conscientiousness, prior experience, achievement emotions and academic procrastination in online learning environments. British Journal of Educational Technology, 54(4), 898–923. https://doi.org/10.1111/bjet.13302</w:t>
+        <w:t>Scientific Reports, 15</w:t>
+      </w:r>
+      <w:r>
+        <w:rPr>
+          <w:rFonts w:ascii="Times New Roman" w:hAnsi="Times New Roman" w:eastAsia="Times New Roman"/>
+          <w:sz w:val="24"/>
+        </w:rPr>
+        <w:t>, 16484. https://doi.org/10.1038/s41598-025-01038-7</w:t>
       </w:r>
     </w:p>
     <w:p>
@@ -6894,7 +6864,7 @@
           <w:rFonts w:ascii="Times New Roman" w:hAnsi="Times New Roman" w:eastAsia="Times New Roman"/>
           <w:sz w:val="24"/>
         </w:rPr>
-        <w:t xml:space="preserve">Duval, S., &amp; Tweedie, R. (2000). Trim and fill: A simple funnel-plot-based method of testing and adjusting for publication bias in meta-analysis. </w:t>
+        <w:t xml:space="preserve">Borenstein, </w:t>
       </w:r>
       <w:r>
         <w:rPr>
@@ -6902,14 +6872,14 @@
           <w:i/>
           <w:sz w:val="24"/>
         </w:rPr>
-        <w:t>Biometrics, 56</w:t>
-      </w:r>
-      <w:r>
-        <w:rPr>
-          <w:rFonts w:ascii="Times New Roman" w:hAnsi="Times New Roman" w:eastAsia="Times New Roman"/>
-          <w:sz w:val="24"/>
-        </w:rPr>
-        <w:t>(2), 455–463. https://doi.org/10.1111/j.0006-341x.2000.00455.x</w:t>
+        <w:t>M</w:t>
+      </w:r>
+      <w:r>
+        <w:rPr>
+          <w:rFonts w:ascii="Times New Roman" w:hAnsi="Times New Roman" w:eastAsia="Times New Roman"/>
+          <w:sz w:val="24"/>
+        </w:rPr>
+        <w:t>., Hedges, L. V., Higgins, J. P. T., &amp; Rothstein, H. R. (2009). Introduction to meta-analysis. John Wiley &amp; Sons.</w:t>
       </w:r>
     </w:p>
     <w:p>
@@ -6922,7 +6892,7 @@
           <w:rFonts w:ascii="Times New Roman" w:hAnsi="Times New Roman" w:eastAsia="Times New Roman"/>
           <w:sz w:val="24"/>
         </w:rPr>
-        <w:t xml:space="preserve">Egger, </w:t>
+        <w:t xml:space="preserve">Borenstein, </w:t>
       </w:r>
       <w:r>
         <w:rPr>
@@ -6937,22 +6907,7 @@
           <w:rFonts w:ascii="Times New Roman" w:hAnsi="Times New Roman" w:eastAsia="Times New Roman"/>
           <w:sz w:val="24"/>
         </w:rPr>
-        <w:t xml:space="preserve">., Davey Smith, G., Schneider, </w:t>
-      </w:r>
-      <w:r>
-        <w:rPr>
-          <w:rFonts w:ascii="Times New Roman" w:hAnsi="Times New Roman" w:eastAsia="Times New Roman"/>
-          <w:i/>
-          <w:sz w:val="24"/>
-        </w:rPr>
-        <w:t>M</w:t>
-      </w:r>
-      <w:r>
-        <w:rPr>
-          <w:rFonts w:ascii="Times New Roman" w:hAnsi="Times New Roman" w:eastAsia="Times New Roman"/>
-          <w:sz w:val="24"/>
-        </w:rPr>
-        <w:t>., &amp; Minder, C. (1997). Bias in meta-analysis detected by a simple, graphical test. BMJ, 315(7109), 629–634. https://doi.org/10.1136/bmj.315.7109.629</w:t>
+        <w:t>., Hedges, L. V., Higgins, J. P. T., &amp; Rothstein, H. R. (2021). Introduction to meta-analysis (2nd ed.). John Wiley &amp; Sons.</w:t>
       </w:r>
     </w:p>
     <w:p>
@@ -6965,7 +6920,7 @@
           <w:rFonts w:ascii="Times New Roman" w:hAnsi="Times New Roman" w:eastAsia="Times New Roman"/>
           <w:sz w:val="24"/>
         </w:rPr>
-        <w:t xml:space="preserve">Gignac, G. E., &amp; Szodorai, E. T. (2016). Effect size guidelines for individual differences researchers. </w:t>
+        <w:t xml:space="preserve">Broadbent, J., &amp; Poon, W. L. (2015). Self-regulated learning strategies &amp; academic achievement in online higher education learning environments: A systematic review. </w:t>
       </w:r>
       <w:r>
         <w:rPr>
@@ -6973,14 +6928,14 @@
           <w:i/>
           <w:sz w:val="24"/>
         </w:rPr>
-        <w:t>Personality and Individual Differences, 102</w:t>
-      </w:r>
-      <w:r>
-        <w:rPr>
-          <w:rFonts w:ascii="Times New Roman" w:hAnsi="Times New Roman" w:eastAsia="Times New Roman"/>
-          <w:sz w:val="24"/>
-        </w:rPr>
-        <w:t>, 74–78. https://doi.org/10.1016/j.paid.2016.06.069</w:t>
+        <w:t>The Internet and Higher Education, 27</w:t>
+      </w:r>
+      <w:r>
+        <w:rPr>
+          <w:rFonts w:ascii="Times New Roman" w:hAnsi="Times New Roman" w:eastAsia="Times New Roman"/>
+          <w:sz w:val="24"/>
+        </w:rPr>
+        <w:t>, 1–13. https://doi.org/10.1016/j.iheduc.2015.04.007</w:t>
       </w:r>
     </w:p>
     <w:p>
@@ -6993,7 +6948,7 @@
           <w:rFonts w:ascii="Times New Roman" w:hAnsi="Times New Roman" w:eastAsia="Times New Roman"/>
           <w:sz w:val="24"/>
         </w:rPr>
-        <w:t xml:space="preserve">Harrer, </w:t>
+        <w:t xml:space="preserve">Chen, S., Cheung, A. C. K., &amp; Zeng, Z. (2025). Big Five personality traits and university students' academic performance: A meta-analysis. </w:t>
       </w:r>
       <w:r>
         <w:rPr>
@@ -7001,14 +6956,14 @@
           <w:i/>
           <w:sz w:val="24"/>
         </w:rPr>
-        <w:t>M</w:t>
-      </w:r>
-      <w:r>
-        <w:rPr>
-          <w:rFonts w:ascii="Times New Roman" w:hAnsi="Times New Roman" w:eastAsia="Times New Roman"/>
-          <w:sz w:val="24"/>
-        </w:rPr>
-        <w:t>., Cuijpers, P., Furukawa, T. A., &amp; Ebert, D. D. (2021). Doing meta-analysis with R: A hands-on guide. Chapman &amp; Hall/CRC Press.</w:t>
+        <w:t>Personality and Individual Differences, 240</w:t>
+      </w:r>
+      <w:r>
+        <w:rPr>
+          <w:rFonts w:ascii="Times New Roman" w:hAnsi="Times New Roman" w:eastAsia="Times New Roman"/>
+          <w:sz w:val="24"/>
+        </w:rPr>
+        <w:t>, 113163. https://doi.org/10.1016/j.paid.2025.113163</w:t>
       </w:r>
     </w:p>
     <w:p>
@@ -7021,7 +6976,7 @@
           <w:rFonts w:ascii="Times New Roman" w:hAnsi="Times New Roman" w:eastAsia="Times New Roman"/>
           <w:sz w:val="24"/>
         </w:rPr>
-        <w:t xml:space="preserve">Hunter, E. G., Niblock, J., Barefoot, S., Miller, J., Hughes, J., Kite, L., &amp; Scarletto, E. (2025). The influence of student personality traits on satisfaction and success in online education in higher education: A systematic review. </w:t>
+        <w:t xml:space="preserve">Cheng, S.-L., Chang, J.-C., Quilantan-Garza, K., &amp; Gutierrez, </w:t>
       </w:r>
       <w:r>
         <w:rPr>
@@ -7029,14 +6984,14 @@
           <w:i/>
           <w:sz w:val="24"/>
         </w:rPr>
-        <w:t>Journal of Occupational Therapy Education, 9</w:t>
-      </w:r>
-      <w:r>
-        <w:rPr>
-          <w:rFonts w:ascii="Times New Roman" w:hAnsi="Times New Roman" w:eastAsia="Times New Roman"/>
-          <w:sz w:val="24"/>
-        </w:rPr>
-        <w:t>(2), Article 9. https://doi.org/10.26681/jote.2025.090209</w:t>
+        <w:t>M</w:t>
+      </w:r>
+      <w:r>
+        <w:rPr>
+          <w:rFonts w:ascii="Times New Roman" w:hAnsi="Times New Roman" w:eastAsia="Times New Roman"/>
+          <w:sz w:val="24"/>
+        </w:rPr>
+        <w:t>. L. (2023). Conscientiousness, prior experience, achievement emotions and academic procrastination in online learning environments. British Journal of Educational Technology, 54(4), 898–923. https://doi.org/10.1111/bjet.13302</w:t>
       </w:r>
     </w:p>
     <w:p>
@@ -7049,7 +7004,7 @@
           <w:rFonts w:ascii="Times New Roman" w:hAnsi="Times New Roman" w:eastAsia="Times New Roman"/>
           <w:sz w:val="24"/>
         </w:rPr>
-        <w:t xml:space="preserve">IntHout, J., Ioannidis, J. P. A., &amp; Borm, G. </w:t>
+        <w:t xml:space="preserve">Cohen, A., &amp; Baruth, O. (2017). Personality, learning, and satisfaction in fully online academic courses. </w:t>
       </w:r>
       <w:r>
         <w:rPr>
@@ -7057,14 +7012,14 @@
           <w:i/>
           <w:sz w:val="24"/>
         </w:rPr>
-        <w:t>F</w:t>
-      </w:r>
-      <w:r>
-        <w:rPr>
-          <w:rFonts w:ascii="Times New Roman" w:hAnsi="Times New Roman" w:eastAsia="Times New Roman"/>
-          <w:sz w:val="24"/>
-        </w:rPr>
-        <w:t>. (2014). The Hartung-Knapp-Sidik-Jonkman method for random effects meta-analysis is straightforward and considerably outperforms the standard DerSimonian-Laird method. BMC Medical Research Methodology, 14, 25. https://doi.org/10.1186/1471-2288-14-25</w:t>
+        <w:t>Computers in Human Behavior, 72</w:t>
+      </w:r>
+      <w:r>
+        <w:rPr>
+          <w:rFonts w:ascii="Times New Roman" w:hAnsi="Times New Roman" w:eastAsia="Times New Roman"/>
+          <w:sz w:val="24"/>
+        </w:rPr>
+        <w:t>, 1–12. https://doi.org/10.1016/j.chb.2017.02.030</w:t>
       </w:r>
     </w:p>
     <w:p>
@@ -7077,7 +7032,7 @@
           <w:rFonts w:ascii="Times New Roman" w:hAnsi="Times New Roman" w:eastAsia="Times New Roman"/>
           <w:sz w:val="24"/>
         </w:rPr>
-        <w:t xml:space="preserve">Mammadov, S. (2022). Big Five personality traits and academic performance: A meta-analysis. </w:t>
+        <w:t xml:space="preserve">Duval, S., &amp; Tweedie, R. (2000). Trim and fill: A simple funnel-plot-based method of testing and adjusting for publication bias in meta-analysis. </w:t>
       </w:r>
       <w:r>
         <w:rPr>
@@ -7085,14 +7040,14 @@
           <w:i/>
           <w:sz w:val="24"/>
         </w:rPr>
-        <w:t>Journal of Personality, 90</w:t>
-      </w:r>
-      <w:r>
-        <w:rPr>
-          <w:rFonts w:ascii="Times New Roman" w:hAnsi="Times New Roman" w:eastAsia="Times New Roman"/>
-          <w:sz w:val="24"/>
-        </w:rPr>
-        <w:t>(2), 222–255. https://doi.org/10.1111/jopy.12663</w:t>
+        <w:t>Biometrics, 56</w:t>
+      </w:r>
+      <w:r>
+        <w:rPr>
+          <w:rFonts w:ascii="Times New Roman" w:hAnsi="Times New Roman" w:eastAsia="Times New Roman"/>
+          <w:sz w:val="24"/>
+        </w:rPr>
+        <w:t>(2), 455–463. https://doi.org/10.1111/j.0006-341x.2000.00455.x</w:t>
       </w:r>
     </w:p>
     <w:p>
@@ -7105,7 +7060,7 @@
           <w:rFonts w:ascii="Times New Roman" w:hAnsi="Times New Roman" w:eastAsia="Times New Roman"/>
           <w:sz w:val="24"/>
         </w:rPr>
-        <w:t xml:space="preserve">McAbee, S. T., &amp; Oswald, </w:t>
+        <w:t xml:space="preserve">Egger, </w:t>
       </w:r>
       <w:r>
         <w:rPr>
@@ -7113,14 +7068,29 @@
           <w:i/>
           <w:sz w:val="24"/>
         </w:rPr>
-        <w:t>F</w:t>
-      </w:r>
-      <w:r>
-        <w:rPr>
-          <w:rFonts w:ascii="Times New Roman" w:hAnsi="Times New Roman" w:eastAsia="Times New Roman"/>
-          <w:sz w:val="24"/>
-        </w:rPr>
-        <w:t>. L. (2013). The criterion-related validity of personality measures for predicting GPA: A meta-analytic validity competition. Psychological Assessment, 25(2), 532–544. https://doi.org/10.1037/a0031748</w:t>
+        <w:t>M</w:t>
+      </w:r>
+      <w:r>
+        <w:rPr>
+          <w:rFonts w:ascii="Times New Roman" w:hAnsi="Times New Roman" w:eastAsia="Times New Roman"/>
+          <w:sz w:val="24"/>
+        </w:rPr>
+        <w:t xml:space="preserve">., Davey Smith, G., Schneider, </w:t>
+      </w:r>
+      <w:r>
+        <w:rPr>
+          <w:rFonts w:ascii="Times New Roman" w:hAnsi="Times New Roman" w:eastAsia="Times New Roman"/>
+          <w:i/>
+          <w:sz w:val="24"/>
+        </w:rPr>
+        <w:t>M</w:t>
+      </w:r>
+      <w:r>
+        <w:rPr>
+          <w:rFonts w:ascii="Times New Roman" w:hAnsi="Times New Roman" w:eastAsia="Times New Roman"/>
+          <w:sz w:val="24"/>
+        </w:rPr>
+        <w:t>., &amp; Minder, C. (1997). Bias in meta-analysis detected by a simple, graphical test. BMJ, 315(7109), 629–634. https://doi.org/10.1136/bmj.315.7109.629</w:t>
       </w:r>
     </w:p>
     <w:p>
@@ -7133,7 +7103,7 @@
           <w:rFonts w:ascii="Times New Roman" w:hAnsi="Times New Roman" w:eastAsia="Times New Roman"/>
           <w:sz w:val="24"/>
         </w:rPr>
-        <w:t xml:space="preserve">Meyer, J., Jansen, T., Hübner, </w:t>
+        <w:t xml:space="preserve">Eilam, B., Zeidner, </w:t>
       </w:r>
       <w:r>
         <w:rPr>
@@ -7141,14 +7111,14 @@
           <w:i/>
           <w:sz w:val="24"/>
         </w:rPr>
-        <w:t>N</w:t>
-      </w:r>
-      <w:r>
-        <w:rPr>
-          <w:rFonts w:ascii="Times New Roman" w:hAnsi="Times New Roman" w:eastAsia="Times New Roman"/>
-          <w:sz w:val="24"/>
-        </w:rPr>
-        <w:t>., &amp; Lüdtke, O. (2023). Disentangling the association between the Big Five personality traits and student achievement: Meta-analytic evidence on the role of domain specificity and achievement measures. Educational Psychology Review, 35, Article 12. https://doi.org/10.1007/s10648-023-09736-2</w:t>
+        <w:t>M</w:t>
+      </w:r>
+      <w:r>
+        <w:rPr>
+          <w:rFonts w:ascii="Times New Roman" w:hAnsi="Times New Roman" w:eastAsia="Times New Roman"/>
+          <w:sz w:val="24"/>
+        </w:rPr>
+        <w:t>., &amp; Aharon, I. (2009). Student conscientiousness, self-regulated learning, and science achievement: An explorative field study. Psychology in the Schools, 46(5), 420–432. https://doi.org/10.1002/pits.20387</w:t>
       </w:r>
     </w:p>
     <w:p>
@@ -7161,7 +7131,7 @@
           <w:rFonts w:ascii="Times New Roman" w:hAnsi="Times New Roman" w:eastAsia="Times New Roman"/>
           <w:sz w:val="24"/>
         </w:rPr>
-        <w:t xml:space="preserve">Moher, D., Shamseer, L., Clarke, </w:t>
+        <w:t xml:space="preserve">Elvers, G. C., Polzella, D. J., &amp; Graetz, K. (2003). Procrastination in online courses: Performance and attitudinal differences. </w:t>
       </w:r>
       <w:r>
         <w:rPr>
@@ -7169,29 +7139,14 @@
           <w:i/>
           <w:sz w:val="24"/>
         </w:rPr>
-        <w:t>M</w:t>
-      </w:r>
-      <w:r>
-        <w:rPr>
-          <w:rFonts w:ascii="Times New Roman" w:hAnsi="Times New Roman" w:eastAsia="Times New Roman"/>
-          <w:sz w:val="24"/>
-        </w:rPr>
-        <w:t xml:space="preserve">., Ghersi, D., Liberati, A., Petticrew, </w:t>
-      </w:r>
-      <w:r>
-        <w:rPr>
-          <w:rFonts w:ascii="Times New Roman" w:hAnsi="Times New Roman" w:eastAsia="Times New Roman"/>
-          <w:i/>
-          <w:sz w:val="24"/>
-        </w:rPr>
-        <w:t>M</w:t>
-      </w:r>
-      <w:r>
-        <w:rPr>
-          <w:rFonts w:ascii="Times New Roman" w:hAnsi="Times New Roman" w:eastAsia="Times New Roman"/>
-          <w:sz w:val="24"/>
-        </w:rPr>
-        <w:t>., Shekelle, P., Stewart, L. A., &amp; PRISMA-P Group. (2015). Preferred reporting items for systematic review and meta-analysis protocols (PRISMA-P) 2015 statement. Systematic Reviews, 4(1), 1. https://doi.org/10.1186/2046-4053-4-1</w:t>
+        <w:t>Teaching of Psychology, 30</w:t>
+      </w:r>
+      <w:r>
+        <w:rPr>
+          <w:rFonts w:ascii="Times New Roman" w:hAnsi="Times New Roman" w:eastAsia="Times New Roman"/>
+          <w:sz w:val="24"/>
+        </w:rPr>
+        <w:t>(2), 159–162. https://doi.org/10.1207/S15328023TOP3002_13</w:t>
       </w:r>
     </w:p>
     <w:p>
@@ -7204,7 +7159,7 @@
           <w:rFonts w:ascii="Times New Roman" w:hAnsi="Times New Roman" w:eastAsia="Times New Roman"/>
           <w:sz w:val="24"/>
         </w:rPr>
-        <w:t xml:space="preserve">Moola, S., Munn, Z., Tufanaru, C., Aromataris, E., Sears, K., Sfetcu, R., Currie, </w:t>
+        <w:t xml:space="preserve">Gignac, G. E., &amp; Szodorai, E. T. (2016). Effect size guidelines for individual differences researchers. </w:t>
       </w:r>
       <w:r>
         <w:rPr>
@@ -7212,14 +7167,14 @@
           <w:i/>
           <w:sz w:val="24"/>
         </w:rPr>
-        <w:t>M</w:t>
-      </w:r>
-      <w:r>
-        <w:rPr>
-          <w:rFonts w:ascii="Times New Roman" w:hAnsi="Times New Roman" w:eastAsia="Times New Roman"/>
-          <w:sz w:val="24"/>
-        </w:rPr>
-        <w:t>., Qureshi, R., Mattis, P., Lisy, K., &amp; Mu, P.-F. (2017). Chapter 7: Systematic reviews of etiology and risk. In E. Aromataris &amp; Z. Munn (Eds.), Joanna Briggs Institute Reviewer's Manual. The Joanna Briggs Institute.</w:t>
+        <w:t>Personality and Individual Differences, 102</w:t>
+      </w:r>
+      <w:r>
+        <w:rPr>
+          <w:rFonts w:ascii="Times New Roman" w:hAnsi="Times New Roman" w:eastAsia="Times New Roman"/>
+          <w:sz w:val="24"/>
+        </w:rPr>
+        <w:t>, 74–78. https://doi.org/10.1016/j.paid.2016.06.069</w:t>
       </w:r>
     </w:p>
     <w:p>
@@ -7232,7 +7187,7 @@
           <w:rFonts w:ascii="Times New Roman" w:hAnsi="Times New Roman" w:eastAsia="Times New Roman"/>
           <w:sz w:val="24"/>
         </w:rPr>
-        <w:t xml:space="preserve">Page, </w:t>
+        <w:t xml:space="preserve">Harrer, </w:t>
       </w:r>
       <w:r>
         <w:rPr>
@@ -7247,82 +7202,7 @@
           <w:rFonts w:ascii="Times New Roman" w:hAnsi="Times New Roman" w:eastAsia="Times New Roman"/>
           <w:sz w:val="24"/>
         </w:rPr>
-        <w:t xml:space="preserve">. J., McKenzie, J. E., Bossuyt, P. </w:t>
-      </w:r>
-      <w:r>
-        <w:rPr>
-          <w:rFonts w:ascii="Times New Roman" w:hAnsi="Times New Roman" w:eastAsia="Times New Roman"/>
-          <w:i/>
-          <w:sz w:val="24"/>
-        </w:rPr>
-        <w:t>M</w:t>
-      </w:r>
-      <w:r>
-        <w:rPr>
-          <w:rFonts w:ascii="Times New Roman" w:hAnsi="Times New Roman" w:eastAsia="Times New Roman"/>
-          <w:sz w:val="24"/>
-        </w:rPr>
-        <w:t xml:space="preserve">., Boutron, I., Hoffmann, T. C., Mulrow, C. D., Shamseer, L., Tetzlaff, J. </w:t>
-      </w:r>
-      <w:r>
-        <w:rPr>
-          <w:rFonts w:ascii="Times New Roman" w:hAnsi="Times New Roman" w:eastAsia="Times New Roman"/>
-          <w:i/>
-          <w:sz w:val="24"/>
-        </w:rPr>
-        <w:t>M</w:t>
-      </w:r>
-      <w:r>
-        <w:rPr>
-          <w:rFonts w:ascii="Times New Roman" w:hAnsi="Times New Roman" w:eastAsia="Times New Roman"/>
-          <w:sz w:val="24"/>
-        </w:rPr>
-        <w:t xml:space="preserve">., Akl, E. A., Brennan, S. E., Chou, R., Glanville, J., Grimshaw, J. </w:t>
-      </w:r>
-      <w:r>
-        <w:rPr>
-          <w:rFonts w:ascii="Times New Roman" w:hAnsi="Times New Roman" w:eastAsia="Times New Roman"/>
-          <w:i/>
-          <w:sz w:val="24"/>
-        </w:rPr>
-        <w:t>M</w:t>
-      </w:r>
-      <w:r>
-        <w:rPr>
-          <w:rFonts w:ascii="Times New Roman" w:hAnsi="Times New Roman" w:eastAsia="Times New Roman"/>
-          <w:sz w:val="24"/>
-        </w:rPr>
-        <w:t xml:space="preserve">., Hróbjartsson, A., Lalu, </w:t>
-      </w:r>
-      <w:r>
-        <w:rPr>
-          <w:rFonts w:ascii="Times New Roman" w:hAnsi="Times New Roman" w:eastAsia="Times New Roman"/>
-          <w:i/>
-          <w:sz w:val="24"/>
-        </w:rPr>
-        <w:t>M</w:t>
-      </w:r>
-      <w:r>
-        <w:rPr>
-          <w:rFonts w:ascii="Times New Roman" w:hAnsi="Times New Roman" w:eastAsia="Times New Roman"/>
-          <w:sz w:val="24"/>
-        </w:rPr>
-        <w:t xml:space="preserve">. </w:t>
-      </w:r>
-      <w:r>
-        <w:rPr>
-          <w:rFonts w:ascii="Times New Roman" w:hAnsi="Times New Roman" w:eastAsia="Times New Roman"/>
-          <w:i/>
-          <w:sz w:val="24"/>
-        </w:rPr>
-        <w:t>M</w:t>
-      </w:r>
-      <w:r>
-        <w:rPr>
-          <w:rFonts w:ascii="Times New Roman" w:hAnsi="Times New Roman" w:eastAsia="Times New Roman"/>
-          <w:sz w:val="24"/>
-        </w:rPr>
-        <w:t>., Li, T., Loder, E. W., Mayo-Wilson, E., McDonald, S., … Moher, D. (2021). The PRISMA 2020 statement: An updated guideline for reporting systematic reviews. BMJ, 372, n71. https://doi.org/10.1136/bmj.n71</w:t>
+        <w:t>., Cuijpers, P., Furukawa, T. A., &amp; Ebert, D. D. (2021). Doing meta-analysis with R: A hands-on guide. Chapman &amp; Hall/CRC Press.</w:t>
       </w:r>
     </w:p>
     <w:p>
@@ -7335,7 +7215,7 @@
           <w:rFonts w:ascii="Times New Roman" w:hAnsi="Times New Roman" w:eastAsia="Times New Roman"/>
           <w:sz w:val="24"/>
         </w:rPr>
-        <w:t xml:space="preserve">Peterson, R. A., &amp; Brown, S. P. (2005). On the use of beta coefficients in meta-analysis. </w:t>
+        <w:t xml:space="preserve">Hidalgo-Fuentes, S., Martínez-Álvarez, I., Llamas-Salguero, </w:t>
       </w:r>
       <w:r>
         <w:rPr>
@@ -7343,14 +7223,29 @@
           <w:i/>
           <w:sz w:val="24"/>
         </w:rPr>
-        <w:t>Journal of Applied Psychology, 90</w:t>
-      </w:r>
-      <w:r>
-        <w:rPr>
-          <w:rFonts w:ascii="Times New Roman" w:hAnsi="Times New Roman" w:eastAsia="Times New Roman"/>
-          <w:sz w:val="24"/>
-        </w:rPr>
-        <w:t>(1), 175–181. https://doi.org/10.1037/0021-9010.90.1.175</w:t>
+        <w:t>F</w:t>
+      </w:r>
+      <w:r>
+        <w:rPr>
+          <w:rFonts w:ascii="Times New Roman" w:hAnsi="Times New Roman" w:eastAsia="Times New Roman"/>
+          <w:sz w:val="24"/>
+        </w:rPr>
+        <w:t xml:space="preserve">., Pineda-Zelaya, I. S., Merino-Soto, C., &amp; Chans, G. </w:t>
+      </w:r>
+      <w:r>
+        <w:rPr>
+          <w:rFonts w:ascii="Times New Roman" w:hAnsi="Times New Roman" w:eastAsia="Times New Roman"/>
+          <w:i/>
+          <w:sz w:val="24"/>
+        </w:rPr>
+        <w:t>M</w:t>
+      </w:r>
+      <w:r>
+        <w:rPr>
+          <w:rFonts w:ascii="Times New Roman" w:hAnsi="Times New Roman" w:eastAsia="Times New Roman"/>
+          <w:sz w:val="24"/>
+        </w:rPr>
+        <w:t>. (2024). The role of big five traits and self-esteem on academic procrastination in Honduran and Spanish university students: A cross-cultural study. Heliyon, 10(17), e36172. https://doi.org/10.1016/j.heliyon.2024.e36172</w:t>
       </w:r>
     </w:p>
     <w:p>
@@ -7363,7 +7258,7 @@
           <w:rFonts w:ascii="Times New Roman" w:hAnsi="Times New Roman" w:eastAsia="Times New Roman"/>
           <w:sz w:val="24"/>
         </w:rPr>
-        <w:t xml:space="preserve">Poropat, A. E. (2009). A meta-analysis of the five-factor model of personality and academic performance. </w:t>
+        <w:t xml:space="preserve">Hunter, E. G., Niblock, J., Barefoot, S., Miller, J., Hughes, J., Kite, L., &amp; Scarletto, E. (2025). The influence of student personality traits on satisfaction and success in online education in higher education: A systematic review. </w:t>
       </w:r>
       <w:r>
         <w:rPr>
@@ -7371,14 +7266,14 @@
           <w:i/>
           <w:sz w:val="24"/>
         </w:rPr>
-        <w:t>Psychological Bulletin, 135</w:t>
-      </w:r>
-      <w:r>
-        <w:rPr>
-          <w:rFonts w:ascii="Times New Roman" w:hAnsi="Times New Roman" w:eastAsia="Times New Roman"/>
-          <w:sz w:val="24"/>
-        </w:rPr>
-        <w:t>(2), 322–338. https://doi.org/10.1037/a0014996</w:t>
+        <w:t>Journal of Occupational Therapy Education, 9</w:t>
+      </w:r>
+      <w:r>
+        <w:rPr>
+          <w:rFonts w:ascii="Times New Roman" w:hAnsi="Times New Roman" w:eastAsia="Times New Roman"/>
+          <w:sz w:val="24"/>
+        </w:rPr>
+        <w:t>(2), Article 9. https://doi.org/10.26681/jote.2025.090209</w:t>
       </w:r>
     </w:p>
     <w:p>
@@ -7391,7 +7286,7 @@
           <w:rFonts w:ascii="Times New Roman" w:hAnsi="Times New Roman" w:eastAsia="Times New Roman"/>
           <w:sz w:val="24"/>
         </w:rPr>
-        <w:t xml:space="preserve">Pustejovsky, J. E. (2023). </w:t>
+        <w:t xml:space="preserve">IntHout, J., Ioannidis, J. P. A., &amp; Borm, G. </w:t>
       </w:r>
       <w:r>
         <w:rPr>
@@ -7399,14 +7294,14 @@
           <w:i/>
           <w:sz w:val="24"/>
         </w:rPr>
-        <w:t>clubSandwich: Cluster-robust (sandwich) variance estimators with small-sample corrections</w:t>
-      </w:r>
-      <w:r>
-        <w:rPr>
-          <w:rFonts w:ascii="Times New Roman" w:hAnsi="Times New Roman" w:eastAsia="Times New Roman"/>
-          <w:sz w:val="24"/>
-        </w:rPr>
-        <w:t xml:space="preserve"> (R package version 0.5.10) [Computer software]. https://CRAN.R-project.org/package=clubSandwich</w:t>
+        <w:t>F</w:t>
+      </w:r>
+      <w:r>
+        <w:rPr>
+          <w:rFonts w:ascii="Times New Roman" w:hAnsi="Times New Roman" w:eastAsia="Times New Roman"/>
+          <w:sz w:val="24"/>
+        </w:rPr>
+        <w:t>. (2014). The Hartung-Knapp-Sidik-Jonkman method for random effects meta-analysis is straightforward and considerably outperforms the standard DerSimonian-Laird method. BMC Medical Research Methodology, 14, 25. https://doi.org/10.1186/1471-2288-14-25</w:t>
       </w:r>
     </w:p>
     <w:p>
@@ -7419,7 +7314,7 @@
           <w:rFonts w:ascii="Times New Roman" w:hAnsi="Times New Roman" w:eastAsia="Times New Roman"/>
           <w:sz w:val="24"/>
         </w:rPr>
-        <w:t xml:space="preserve">Raudenbush, S. W. (2009). Analyzing effect sizes: Random-effects models. In H. Cooper, L. V. Hedges, &amp; J. C. Valentine (Eds.), </w:t>
+        <w:t xml:space="preserve">Kaspar, K., Burtniak, K., &amp; Rüth, </w:t>
       </w:r>
       <w:r>
         <w:rPr>
@@ -7427,14 +7322,14 @@
           <w:i/>
           <w:sz w:val="24"/>
         </w:rPr>
-        <w:t>The handbook of research synthesis and meta-analysis</w:t>
-      </w:r>
-      <w:r>
-        <w:rPr>
-          <w:rFonts w:ascii="Times New Roman" w:hAnsi="Times New Roman" w:eastAsia="Times New Roman"/>
-          <w:sz w:val="24"/>
-        </w:rPr>
-        <w:t xml:space="preserve"> (2nd ed., pp. 295–315). Russell Sage Foundation.</w:t>
+        <w:t>M</w:t>
+      </w:r>
+      <w:r>
+        <w:rPr>
+          <w:rFonts w:ascii="Times New Roman" w:hAnsi="Times New Roman" w:eastAsia="Times New Roman"/>
+          <w:sz w:val="24"/>
+        </w:rPr>
+        <w:t>. (2023). Online learning during the Covid-19 pandemic: How university students' perceptions, engagement, and performance are related to their personal characteristics. Current Psychology, 42, 33153–33170. https://doi.org/10.1007/s12144-023-04403-9</w:t>
       </w:r>
     </w:p>
     <w:p>
@@ -7447,7 +7342,7 @@
           <w:rFonts w:ascii="Times New Roman" w:hAnsi="Times New Roman" w:eastAsia="Times New Roman"/>
           <w:sz w:val="24"/>
         </w:rPr>
-        <w:t xml:space="preserve">Rivers, D. J. (2021). The role of personality traits and online academic self-efficacy in acceptance, actual use and achievement in Moodle. </w:t>
+        <w:t xml:space="preserve">MacLean, K. A. (2022). </w:t>
       </w:r>
       <w:r>
         <w:rPr>
@@ -7455,14 +7350,14 @@
           <w:i/>
           <w:sz w:val="24"/>
         </w:rPr>
-        <w:t>Education and Information Technologies, 26</w:t>
-      </w:r>
-      <w:r>
-        <w:rPr>
-          <w:rFonts w:ascii="Times New Roman" w:hAnsi="Times New Roman" w:eastAsia="Times New Roman"/>
-          <w:sz w:val="24"/>
-        </w:rPr>
-        <w:t>(4), 4353–4378. https://doi.org/10.1007/s10639-021-10478-3</w:t>
+        <w:t>Endorsed, or just enforced? Personality and preferences for online learning during COVID-19</w:t>
+      </w:r>
+      <w:r>
+        <w:rPr>
+          <w:rFonts w:ascii="Times New Roman" w:hAnsi="Times New Roman" w:eastAsia="Times New Roman"/>
+          <w:sz w:val="24"/>
+        </w:rPr>
+        <w:t xml:space="preserve"> [Master's thesis, University of Calgary]. PRISM Repository.</w:t>
       </w:r>
     </w:p>
     <w:p>
@@ -7475,7 +7370,7 @@
           <w:rFonts w:ascii="Times New Roman" w:hAnsi="Times New Roman" w:eastAsia="Times New Roman"/>
           <w:sz w:val="24"/>
         </w:rPr>
-        <w:t xml:space="preserve">Rodrigues, J., Rose, R., &amp; Hewig, J. (2024). The relation of Big Five personality traits on academic performance, well-being and home study satisfaction in corona times. </w:t>
+        <w:t xml:space="preserve">Mammadov, S. (2022). Big Five personality traits and academic performance: A meta-analysis. </w:t>
       </w:r>
       <w:r>
         <w:rPr>
@@ -7483,14 +7378,14 @@
           <w:i/>
           <w:sz w:val="24"/>
         </w:rPr>
-        <w:t>European Journal of Investigation in Health, Psychology and Education, 14</w:t>
-      </w:r>
-      <w:r>
-        <w:rPr>
-          <w:rFonts w:ascii="Times New Roman" w:hAnsi="Times New Roman" w:eastAsia="Times New Roman"/>
-          <w:sz w:val="24"/>
-        </w:rPr>
-        <w:t>(2), 368–384. https://doi.org/10.3390/ejihpe14020025</w:t>
+        <w:t>Journal of Personality, 90</w:t>
+      </w:r>
+      <w:r>
+        <w:rPr>
+          <w:rFonts w:ascii="Times New Roman" w:hAnsi="Times New Roman" w:eastAsia="Times New Roman"/>
+          <w:sz w:val="24"/>
+        </w:rPr>
+        <w:t>(2), 222–255. https://doi.org/10.1111/jopy.12663</w:t>
       </w:r>
     </w:p>
     <w:p>
@@ -7503,7 +7398,7 @@
           <w:rFonts w:ascii="Times New Roman" w:hAnsi="Times New Roman" w:eastAsia="Times New Roman"/>
           <w:sz w:val="24"/>
         </w:rPr>
-        <w:t xml:space="preserve">Schünemann, H. J., Higgins, J. P. T., Vist, G. E., Glasziou, P., Akl, E. A., Skoetz, </w:t>
+        <w:t xml:space="preserve">McAbee, S. T., &amp; Oswald, </w:t>
       </w:r>
       <w:r>
         <w:rPr>
@@ -7511,44 +7406,14 @@
           <w:i/>
           <w:sz w:val="24"/>
         </w:rPr>
-        <w:t>N</w:t>
-      </w:r>
-      <w:r>
-        <w:rPr>
-          <w:rFonts w:ascii="Times New Roman" w:hAnsi="Times New Roman" w:eastAsia="Times New Roman"/>
-          <w:sz w:val="24"/>
-        </w:rPr>
-        <w:t xml:space="preserve">., &amp; Guyatt, G. H. (2019). Chapter 14: Completing "Summary of findings" tables and grading the certainty of the evidence. In J. P. T. Higgins, J. Thomas, J. Chandler, </w:t>
-      </w:r>
-      <w:r>
-        <w:rPr>
-          <w:rFonts w:ascii="Times New Roman" w:hAnsi="Times New Roman" w:eastAsia="Times New Roman"/>
-          <w:i/>
-          <w:sz w:val="24"/>
-        </w:rPr>
-        <w:t>M</w:t>
-      </w:r>
-      <w:r>
-        <w:rPr>
-          <w:rFonts w:ascii="Times New Roman" w:hAnsi="Times New Roman" w:eastAsia="Times New Roman"/>
-          <w:sz w:val="24"/>
-        </w:rPr>
-        <w:t xml:space="preserve">. Cumpston, T. Li, </w:t>
-      </w:r>
-      <w:r>
-        <w:rPr>
-          <w:rFonts w:ascii="Times New Roman" w:hAnsi="Times New Roman" w:eastAsia="Times New Roman"/>
-          <w:i/>
-          <w:sz w:val="24"/>
-        </w:rPr>
-        <w:t>M</w:t>
-      </w:r>
-      <w:r>
-        <w:rPr>
-          <w:rFonts w:ascii="Times New Roman" w:hAnsi="Times New Roman" w:eastAsia="Times New Roman"/>
-          <w:sz w:val="24"/>
-        </w:rPr>
-        <w:t>. J. Page, &amp; V. A. Welch (Eds.), Cochrane handbook for systematic reviews of interventions (2nd ed.). John Wiley &amp; Sons.</w:t>
+        <w:t>F</w:t>
+      </w:r>
+      <w:r>
+        <w:rPr>
+          <w:rFonts w:ascii="Times New Roman" w:hAnsi="Times New Roman" w:eastAsia="Times New Roman"/>
+          <w:sz w:val="24"/>
+        </w:rPr>
+        <w:t>. L. (2013). The criterion-related validity of personality measures for predicting GPA: A meta-analytic validity competition. Psychological Assessment, 25(2), 532–544. https://doi.org/10.1037/a0031748</w:t>
       </w:r>
     </w:p>
     <w:p>
@@ -7561,7 +7426,7 @@
           <w:rFonts w:ascii="Times New Roman" w:hAnsi="Times New Roman" w:eastAsia="Times New Roman"/>
           <w:sz w:val="24"/>
         </w:rPr>
-        <w:t xml:space="preserve">Simonsohn, U., Nelson, L. D., &amp; Simmons, J. P. (2014). P-curve: A key to the file-drawer. </w:t>
+        <w:t xml:space="preserve">Meyer, J., Jansen, T., Hübner, </w:t>
       </w:r>
       <w:r>
         <w:rPr>
@@ -7569,14 +7434,14 @@
           <w:i/>
           <w:sz w:val="24"/>
         </w:rPr>
-        <w:t>Journal of Experimental Psychology: General, 143</w:t>
-      </w:r>
-      <w:r>
-        <w:rPr>
-          <w:rFonts w:ascii="Times New Roman" w:hAnsi="Times New Roman" w:eastAsia="Times New Roman"/>
-          <w:sz w:val="24"/>
-        </w:rPr>
-        <w:t>(2), 534–547. https://doi.org/10.1037/a0033242</w:t>
+        <w:t>N</w:t>
+      </w:r>
+      <w:r>
+        <w:rPr>
+          <w:rFonts w:ascii="Times New Roman" w:hAnsi="Times New Roman" w:eastAsia="Times New Roman"/>
+          <w:sz w:val="24"/>
+        </w:rPr>
+        <w:t>., &amp; Lüdtke, O. (2023). Disentangling the association between the Big Five personality traits and student achievement: Meta-analytic evidence on the role of domain specificity and achievement measures. Educational Psychology Review, 35, Article 12. https://doi.org/10.1007/s10648-023-09736-2</w:t>
       </w:r>
     </w:p>
     <w:p>
@@ -7589,7 +7454,7 @@
           <w:rFonts w:ascii="Times New Roman" w:hAnsi="Times New Roman" w:eastAsia="Times New Roman"/>
           <w:sz w:val="24"/>
         </w:rPr>
-        <w:t xml:space="preserve">Stajkovic, A. D., Bandura, A., Locke, E. A., Lee, D., &amp; Sergent, K. (2018). Test of three conceptual models of influence of the big five personality traits and self-efficacy on academic performance: A meta-analytic path-analysis. </w:t>
+        <w:t xml:space="preserve">Moher, D., Shamseer, L., Clarke, </w:t>
       </w:r>
       <w:r>
         <w:rPr>
@@ -7597,14 +7462,29 @@
           <w:i/>
           <w:sz w:val="24"/>
         </w:rPr>
-        <w:t>Personality and Individual Differences, 120</w:t>
-      </w:r>
-      <w:r>
-        <w:rPr>
-          <w:rFonts w:ascii="Times New Roman" w:hAnsi="Times New Roman" w:eastAsia="Times New Roman"/>
-          <w:sz w:val="24"/>
-        </w:rPr>
-        <w:t>, 238–245. https://doi.org/10.1016/j.paid.2017.08.014</w:t>
+        <w:t>M</w:t>
+      </w:r>
+      <w:r>
+        <w:rPr>
+          <w:rFonts w:ascii="Times New Roman" w:hAnsi="Times New Roman" w:eastAsia="Times New Roman"/>
+          <w:sz w:val="24"/>
+        </w:rPr>
+        <w:t xml:space="preserve">., Ghersi, D., Liberati, A., Petticrew, </w:t>
+      </w:r>
+      <w:r>
+        <w:rPr>
+          <w:rFonts w:ascii="Times New Roman" w:hAnsi="Times New Roman" w:eastAsia="Times New Roman"/>
+          <w:i/>
+          <w:sz w:val="24"/>
+        </w:rPr>
+        <w:t>M</w:t>
+      </w:r>
+      <w:r>
+        <w:rPr>
+          <w:rFonts w:ascii="Times New Roman" w:hAnsi="Times New Roman" w:eastAsia="Times New Roman"/>
+          <w:sz w:val="24"/>
+        </w:rPr>
+        <w:t>., Shekelle, P., Stewart, L. A., &amp; PRISMA-P Group. (2015). Preferred reporting items for systematic review and meta-analysis protocols (PRISMA-P) 2015 statement. Systematic Reviews, 4(1), 1. https://doi.org/10.1186/2046-4053-4-1</w:t>
       </w:r>
     </w:p>
     <w:p>
@@ -7617,7 +7497,7 @@
           <w:rFonts w:ascii="Times New Roman" w:hAnsi="Times New Roman" w:eastAsia="Times New Roman"/>
           <w:sz w:val="24"/>
         </w:rPr>
-        <w:t xml:space="preserve">Tipton, E. (2015). Small sample adjustments for robust variance estimation with meta-regression. </w:t>
+        <w:t xml:space="preserve">Moola, S., Munn, Z., Tufanaru, C., Aromataris, E., Sears, K., Sfetcu, R., Currie, </w:t>
       </w:r>
       <w:r>
         <w:rPr>
@@ -7625,14 +7505,14 @@
           <w:i/>
           <w:sz w:val="24"/>
         </w:rPr>
-        <w:t>Psychological Methods, 20</w:t>
-      </w:r>
-      <w:r>
-        <w:rPr>
-          <w:rFonts w:ascii="Times New Roman" w:hAnsi="Times New Roman" w:eastAsia="Times New Roman"/>
-          <w:sz w:val="24"/>
-        </w:rPr>
-        <w:t>(3), 375–393. https://doi.org/10.1037/met0000011</w:t>
+        <w:t>M</w:t>
+      </w:r>
+      <w:r>
+        <w:rPr>
+          <w:rFonts w:ascii="Times New Roman" w:hAnsi="Times New Roman" w:eastAsia="Times New Roman"/>
+          <w:sz w:val="24"/>
+        </w:rPr>
+        <w:t>., Qureshi, R., Mattis, P., Lisy, K., &amp; Mu, P.-F. (2017). Chapter 7: Systematic reviews of etiology and risk. In E. Aromataris &amp; Z. Munn (Eds.), Joanna Briggs Institute Reviewer's Manual. The Joanna Briggs Institute.</w:t>
       </w:r>
     </w:p>
     <w:p>
@@ -7645,7 +7525,22 @@
           <w:rFonts w:ascii="Times New Roman" w:hAnsi="Times New Roman" w:eastAsia="Times New Roman"/>
           <w:sz w:val="24"/>
         </w:rPr>
-        <w:t>Tokiwa, E. (2025). Big Five personality traits and online learning outcomes in Japanese high school students [Manuscript in preparation]. SUNBLAZE Co., Ltd.</w:t>
+        <w:t xml:space="preserve">Mustafa, S., Qiao, Y., Yan, X., Anwar, A., Hao, T., &amp; Rana, S. (2022). Digital students' satisfaction with and intention to use online teaching modes, role of Big Five personality traits. </w:t>
+      </w:r>
+      <w:r>
+        <w:rPr>
+          <w:rFonts w:ascii="Times New Roman" w:hAnsi="Times New Roman" w:eastAsia="Times New Roman"/>
+          <w:i/>
+          <w:sz w:val="24"/>
+        </w:rPr>
+        <w:t>Frontiers in Psychology, 13</w:t>
+      </w:r>
+      <w:r>
+        <w:rPr>
+          <w:rFonts w:ascii="Times New Roman" w:hAnsi="Times New Roman" w:eastAsia="Times New Roman"/>
+          <w:sz w:val="24"/>
+        </w:rPr>
+        <w:t>, 956281. https://doi.org/10.3389/fpsyg.2022.956281</w:t>
       </w:r>
     </w:p>
     <w:p>
@@ -7658,7 +7553,7 @@
           <w:rFonts w:ascii="Times New Roman" w:hAnsi="Times New Roman" w:eastAsia="Times New Roman"/>
           <w:sz w:val="24"/>
         </w:rPr>
-        <w:t xml:space="preserve">Vedel, A. (2014). The Big Five and tertiary academic performance: A systematic review and meta-analysis. </w:t>
+        <w:t xml:space="preserve">Page, </w:t>
       </w:r>
       <w:r>
         <w:rPr>
@@ -7666,14 +7561,89 @@
           <w:i/>
           <w:sz w:val="24"/>
         </w:rPr>
-        <w:t>Personality and Individual Differences, 71</w:t>
-      </w:r>
-      <w:r>
-        <w:rPr>
-          <w:rFonts w:ascii="Times New Roman" w:hAnsi="Times New Roman" w:eastAsia="Times New Roman"/>
-          <w:sz w:val="24"/>
-        </w:rPr>
-        <w:t>, 66–76. https://doi.org/10.1016/j.paid.2014.07.011</w:t>
+        <w:t>M</w:t>
+      </w:r>
+      <w:r>
+        <w:rPr>
+          <w:rFonts w:ascii="Times New Roman" w:hAnsi="Times New Roman" w:eastAsia="Times New Roman"/>
+          <w:sz w:val="24"/>
+        </w:rPr>
+        <w:t xml:space="preserve">. J., McKenzie, J. E., Bossuyt, P. </w:t>
+      </w:r>
+      <w:r>
+        <w:rPr>
+          <w:rFonts w:ascii="Times New Roman" w:hAnsi="Times New Roman" w:eastAsia="Times New Roman"/>
+          <w:i/>
+          <w:sz w:val="24"/>
+        </w:rPr>
+        <w:t>M</w:t>
+      </w:r>
+      <w:r>
+        <w:rPr>
+          <w:rFonts w:ascii="Times New Roman" w:hAnsi="Times New Roman" w:eastAsia="Times New Roman"/>
+          <w:sz w:val="24"/>
+        </w:rPr>
+        <w:t xml:space="preserve">., Boutron, I., Hoffmann, T. C., Mulrow, C. D., Shamseer, L., Tetzlaff, J. </w:t>
+      </w:r>
+      <w:r>
+        <w:rPr>
+          <w:rFonts w:ascii="Times New Roman" w:hAnsi="Times New Roman" w:eastAsia="Times New Roman"/>
+          <w:i/>
+          <w:sz w:val="24"/>
+        </w:rPr>
+        <w:t>M</w:t>
+      </w:r>
+      <w:r>
+        <w:rPr>
+          <w:rFonts w:ascii="Times New Roman" w:hAnsi="Times New Roman" w:eastAsia="Times New Roman"/>
+          <w:sz w:val="24"/>
+        </w:rPr>
+        <w:t xml:space="preserve">., Akl, E. A., Brennan, S. E., Chou, R., Glanville, J., Grimshaw, J. </w:t>
+      </w:r>
+      <w:r>
+        <w:rPr>
+          <w:rFonts w:ascii="Times New Roman" w:hAnsi="Times New Roman" w:eastAsia="Times New Roman"/>
+          <w:i/>
+          <w:sz w:val="24"/>
+        </w:rPr>
+        <w:t>M</w:t>
+      </w:r>
+      <w:r>
+        <w:rPr>
+          <w:rFonts w:ascii="Times New Roman" w:hAnsi="Times New Roman" w:eastAsia="Times New Roman"/>
+          <w:sz w:val="24"/>
+        </w:rPr>
+        <w:t xml:space="preserve">., Hróbjartsson, A., Lalu, </w:t>
+      </w:r>
+      <w:r>
+        <w:rPr>
+          <w:rFonts w:ascii="Times New Roman" w:hAnsi="Times New Roman" w:eastAsia="Times New Roman"/>
+          <w:i/>
+          <w:sz w:val="24"/>
+        </w:rPr>
+        <w:t>M</w:t>
+      </w:r>
+      <w:r>
+        <w:rPr>
+          <w:rFonts w:ascii="Times New Roman" w:hAnsi="Times New Roman" w:eastAsia="Times New Roman"/>
+          <w:sz w:val="24"/>
+        </w:rPr>
+        <w:t xml:space="preserve">. </w:t>
+      </w:r>
+      <w:r>
+        <w:rPr>
+          <w:rFonts w:ascii="Times New Roman" w:hAnsi="Times New Roman" w:eastAsia="Times New Roman"/>
+          <w:i/>
+          <w:sz w:val="24"/>
+        </w:rPr>
+        <w:t>M</w:t>
+      </w:r>
+      <w:r>
+        <w:rPr>
+          <w:rFonts w:ascii="Times New Roman" w:hAnsi="Times New Roman" w:eastAsia="Times New Roman"/>
+          <w:sz w:val="24"/>
+        </w:rPr>
+        <w:t>., Li, T., Loder, E. W., Mayo-Wilson, E., McDonald, S., … Moher, D. (2021). The PRISMA 2020 statement: An updated guideline for reporting systematic reviews. BMJ, 372, n71. https://doi.org/10.1136/bmj.n71</w:t>
       </w:r>
     </w:p>
     <w:p>
@@ -7686,7 +7656,7 @@
           <w:rFonts w:ascii="Times New Roman" w:hAnsi="Times New Roman" w:eastAsia="Times New Roman"/>
           <w:sz w:val="24"/>
         </w:rPr>
-        <w:t xml:space="preserve">Viechtbauer, W. (2010). Conducting meta-analyses in R with the metafor package. </w:t>
+        <w:t xml:space="preserve">Paulhus, D. L. (1998). Interpersonal and intrapsychic adaptiveness of trait self-enhancement: A mixed blessing? </w:t>
       </w:r>
       <w:r>
         <w:rPr>
@@ -7694,14 +7664,14 @@
           <w:i/>
           <w:sz w:val="24"/>
         </w:rPr>
-        <w:t>Journal of Statistical Software, 36</w:t>
-      </w:r>
-      <w:r>
-        <w:rPr>
-          <w:rFonts w:ascii="Times New Roman" w:hAnsi="Times New Roman" w:eastAsia="Times New Roman"/>
-          <w:sz w:val="24"/>
-        </w:rPr>
-        <w:t>(3), 1–48. https://doi.org/10.18637/jss.v036.i03</w:t>
+        <w:t>Journal of Personality and Social Psychology, 74</w:t>
+      </w:r>
+      <w:r>
+        <w:rPr>
+          <w:rFonts w:ascii="Times New Roman" w:hAnsi="Times New Roman" w:eastAsia="Times New Roman"/>
+          <w:sz w:val="24"/>
+        </w:rPr>
+        <w:t>(5), 1197–1208. https://doi.org/10.1037/0022-3514.74.5.1197</w:t>
       </w:r>
     </w:p>
     <w:p>
@@ -7714,7 +7684,7 @@
           <w:rFonts w:ascii="Times New Roman" w:hAnsi="Times New Roman" w:eastAsia="Times New Roman"/>
           <w:sz w:val="24"/>
         </w:rPr>
-        <w:t xml:space="preserve">Wang, P., Wang, </w:t>
+        <w:t xml:space="preserve">Peterson, R. A., &amp; Brown, S. P. (2005). On the use of beta coefficients in meta-analysis. </w:t>
       </w:r>
       <w:r>
         <w:rPr>
@@ -7722,14 +7692,14 @@
           <w:i/>
           <w:sz w:val="24"/>
         </w:rPr>
-        <w:t>F</w:t>
-      </w:r>
-      <w:r>
-        <w:rPr>
-          <w:rFonts w:ascii="Times New Roman" w:hAnsi="Times New Roman" w:eastAsia="Times New Roman"/>
-          <w:sz w:val="24"/>
-        </w:rPr>
-        <w:t>., &amp; Li, Z. (2023). Exploring the ecosystem of K-12 online learning: An empirical study of impact mechanisms in the post-pandemic era. Frontiers in Psychology, 14, 1241477. https://doi.org/10.3389/fpsyg.2023.1241477</w:t>
+        <w:t>Journal of Applied Psychology, 90</w:t>
+      </w:r>
+      <w:r>
+        <w:rPr>
+          <w:rFonts w:ascii="Times New Roman" w:hAnsi="Times New Roman" w:eastAsia="Times New Roman"/>
+          <w:sz w:val="24"/>
+        </w:rPr>
+        <w:t>(1), 175–181. https://doi.org/10.1037/0021-9010.90.1.175</w:t>
       </w:r>
     </w:p>
     <w:p>
@@ -7742,7 +7712,7 @@
           <w:rFonts w:ascii="Times New Roman" w:hAnsi="Times New Roman" w:eastAsia="Times New Roman"/>
           <w:sz w:val="24"/>
         </w:rPr>
-        <w:t xml:space="preserve">Yu, Z. (2021). The effects of gender, educational level, and personality on online learning outcomes during the COVID-19 pandemic. </w:t>
+        <w:t xml:space="preserve">Poropat, A. E. (2009). A meta-analysis of the five-factor model of personality and academic performance. </w:t>
       </w:r>
       <w:r>
         <w:rPr>
@@ -7750,14 +7720,14 @@
           <w:i/>
           <w:sz w:val="24"/>
         </w:rPr>
-        <w:t>International Journal of Educational Technology in Higher Education, 18</w:t>
-      </w:r>
-      <w:r>
-        <w:rPr>
-          <w:rFonts w:ascii="Times New Roman" w:hAnsi="Times New Roman" w:eastAsia="Times New Roman"/>
-          <w:sz w:val="24"/>
-        </w:rPr>
-        <w:t>, Article 14. https://doi.org/10.1186/s41239-021-00252-3</w:t>
+        <w:t>Psychological Bulletin, 135</w:t>
+      </w:r>
+      <w:r>
+        <w:rPr>
+          <w:rFonts w:ascii="Times New Roman" w:hAnsi="Times New Roman" w:eastAsia="Times New Roman"/>
+          <w:sz w:val="24"/>
+        </w:rPr>
+        <w:t>(2), 322–338. https://doi.org/10.1037/a0014996</w:t>
       </w:r>
     </w:p>
     <w:p>
@@ -7770,6 +7740,469 @@
           <w:rFonts w:ascii="Times New Roman" w:hAnsi="Times New Roman" w:eastAsia="Times New Roman"/>
           <w:sz w:val="24"/>
         </w:rPr>
+        <w:t xml:space="preserve">Pustejovsky, J. E. (2023). </w:t>
+      </w:r>
+      <w:r>
+        <w:rPr>
+          <w:rFonts w:ascii="Times New Roman" w:hAnsi="Times New Roman" w:eastAsia="Times New Roman"/>
+          <w:i/>
+          <w:sz w:val="24"/>
+        </w:rPr>
+        <w:t>clubSandwich: Cluster-robust (sandwich) variance estimators with small-sample corrections</w:t>
+      </w:r>
+      <w:r>
+        <w:rPr>
+          <w:rFonts w:ascii="Times New Roman" w:hAnsi="Times New Roman" w:eastAsia="Times New Roman"/>
+          <w:sz w:val="24"/>
+        </w:rPr>
+        <w:t xml:space="preserve"> (R package version 0.5.10) [Computer software]. https://CRAN.R-project.org/package=clubSandwich</w:t>
+      </w:r>
+    </w:p>
+    <w:p>
+      <w:pPr>
+        <w:spacing w:line="480" w:lineRule="auto" w:before="0" w:after="0"/>
+        <w:ind w:left="720" w:hanging="720"/>
+      </w:pPr>
+      <w:r>
+        <w:rPr>
+          <w:rFonts w:ascii="Times New Roman" w:hAnsi="Times New Roman" w:eastAsia="Times New Roman"/>
+          <w:sz w:val="24"/>
+        </w:rPr>
+        <w:t xml:space="preserve">Quigley, </w:t>
+      </w:r>
+      <w:r>
+        <w:rPr>
+          <w:rFonts w:ascii="Times New Roman" w:hAnsi="Times New Roman" w:eastAsia="Times New Roman"/>
+          <w:i/>
+          <w:sz w:val="24"/>
+        </w:rPr>
+        <w:t>M</w:t>
+      </w:r>
+      <w:r>
+        <w:rPr>
+          <w:rFonts w:ascii="Times New Roman" w:hAnsi="Times New Roman" w:eastAsia="Times New Roman"/>
+          <w:sz w:val="24"/>
+        </w:rPr>
+        <w:t>., Bradley, A., Playfoot, D., &amp; Harrad, R. (2022). Personality traits and stress perception as predictors of students' online engagement during the COVID-19 pandemic. Personality and Individual Differences, 194, 111645. https://doi.org/10.1016/j.paid.2022.111645</w:t>
+      </w:r>
+    </w:p>
+    <w:p>
+      <w:pPr>
+        <w:spacing w:line="480" w:lineRule="auto" w:before="0" w:after="0"/>
+        <w:ind w:left="720" w:hanging="720"/>
+      </w:pPr>
+      <w:r>
+        <w:rPr>
+          <w:rFonts w:ascii="Times New Roman" w:hAnsi="Times New Roman" w:eastAsia="Times New Roman"/>
+          <w:sz w:val="24"/>
+        </w:rPr>
+        <w:t xml:space="preserve">Raudenbush, S. W. (2009). Analyzing effect sizes: Random-effects models. In H. Cooper, L. V. Hedges, &amp; J. C. Valentine (Eds.), </w:t>
+      </w:r>
+      <w:r>
+        <w:rPr>
+          <w:rFonts w:ascii="Times New Roman" w:hAnsi="Times New Roman" w:eastAsia="Times New Roman"/>
+          <w:i/>
+          <w:sz w:val="24"/>
+        </w:rPr>
+        <w:t>The handbook of research synthesis and meta-analysis</w:t>
+      </w:r>
+      <w:r>
+        <w:rPr>
+          <w:rFonts w:ascii="Times New Roman" w:hAnsi="Times New Roman" w:eastAsia="Times New Roman"/>
+          <w:sz w:val="24"/>
+        </w:rPr>
+        <w:t xml:space="preserve"> (2nd ed., pp. 295–315). Russell Sage Foundation.</w:t>
+      </w:r>
+    </w:p>
+    <w:p>
+      <w:pPr>
+        <w:spacing w:line="480" w:lineRule="auto" w:before="0" w:after="0"/>
+        <w:ind w:left="720" w:hanging="720"/>
+      </w:pPr>
+      <w:r>
+        <w:rPr>
+          <w:rFonts w:ascii="Times New Roman" w:hAnsi="Times New Roman" w:eastAsia="Times New Roman"/>
+          <w:sz w:val="24"/>
+        </w:rPr>
+        <w:t xml:space="preserve">Rivers, D. J. (2021). The role of personality traits and online academic self-efficacy in acceptance, actual use and achievement in Moodle. </w:t>
+      </w:r>
+      <w:r>
+        <w:rPr>
+          <w:rFonts w:ascii="Times New Roman" w:hAnsi="Times New Roman" w:eastAsia="Times New Roman"/>
+          <w:i/>
+          <w:sz w:val="24"/>
+        </w:rPr>
+        <w:t>Education and Information Technologies, 26</w:t>
+      </w:r>
+      <w:r>
+        <w:rPr>
+          <w:rFonts w:ascii="Times New Roman" w:hAnsi="Times New Roman" w:eastAsia="Times New Roman"/>
+          <w:sz w:val="24"/>
+        </w:rPr>
+        <w:t>(4), 4353–4378. https://doi.org/10.1007/s10639-021-10478-3</w:t>
+      </w:r>
+    </w:p>
+    <w:p>
+      <w:pPr>
+        <w:spacing w:line="480" w:lineRule="auto" w:before="0" w:after="0"/>
+        <w:ind w:left="720" w:hanging="720"/>
+      </w:pPr>
+      <w:r>
+        <w:rPr>
+          <w:rFonts w:ascii="Times New Roman" w:hAnsi="Times New Roman" w:eastAsia="Times New Roman"/>
+          <w:sz w:val="24"/>
+        </w:rPr>
+        <w:t xml:space="preserve">Rodrigues, J., Rose, R., &amp; Hewig, J. (2024). The relation of Big Five personality traits on academic performance, well-being and home study satisfaction in corona times. </w:t>
+      </w:r>
+      <w:r>
+        <w:rPr>
+          <w:rFonts w:ascii="Times New Roman" w:hAnsi="Times New Roman" w:eastAsia="Times New Roman"/>
+          <w:i/>
+          <w:sz w:val="24"/>
+        </w:rPr>
+        <w:t>European Journal of Investigation in Health, Psychology and Education, 14</w:t>
+      </w:r>
+      <w:r>
+        <w:rPr>
+          <w:rFonts w:ascii="Times New Roman" w:hAnsi="Times New Roman" w:eastAsia="Times New Roman"/>
+          <w:sz w:val="24"/>
+        </w:rPr>
+        <w:t>(2), 368–384. https://doi.org/10.3390/ejihpe14020025</w:t>
+      </w:r>
+    </w:p>
+    <w:p>
+      <w:pPr>
+        <w:spacing w:line="480" w:lineRule="auto" w:before="0" w:after="0"/>
+        <w:ind w:left="720" w:hanging="720"/>
+      </w:pPr>
+      <w:r>
+        <w:rPr>
+          <w:rFonts w:ascii="Times New Roman" w:hAnsi="Times New Roman" w:eastAsia="Times New Roman"/>
+          <w:sz w:val="24"/>
+        </w:rPr>
+        <w:t xml:space="preserve">Sahinidis, A. G., &amp; Tsaknis, P. A. (2021). Exploring the relationship of the Big Five personality traits with student satisfaction with synchronous online academic learning: The case of Covid-19-induced changes. In A. Kavoura, S. Kefallonitis, &amp; P. Theodoridis (Eds.), </w:t>
+      </w:r>
+      <w:r>
+        <w:rPr>
+          <w:rFonts w:ascii="Times New Roman" w:hAnsi="Times New Roman" w:eastAsia="Times New Roman"/>
+          <w:i/>
+          <w:sz w:val="24"/>
+        </w:rPr>
+        <w:t>Strategic Innovative Marketing and Tourism</w:t>
+      </w:r>
+      <w:r>
+        <w:rPr>
+          <w:rFonts w:ascii="Times New Roman" w:hAnsi="Times New Roman" w:eastAsia="Times New Roman"/>
+          <w:sz w:val="24"/>
+        </w:rPr>
+        <w:t xml:space="preserve"> (pp. 116–130). Springer. https://doi.org/10.1007/978-3-030-66154-0_10</w:t>
+      </w:r>
+    </w:p>
+    <w:p>
+      <w:pPr>
+        <w:spacing w:line="480" w:lineRule="auto" w:before="0" w:after="0"/>
+        <w:ind w:left="720" w:hanging="720"/>
+      </w:pPr>
+      <w:r>
+        <w:rPr>
+          <w:rFonts w:ascii="Times New Roman" w:hAnsi="Times New Roman" w:eastAsia="Times New Roman"/>
+          <w:sz w:val="24"/>
+        </w:rPr>
+        <w:t xml:space="preserve">Schünemann, H. J., Higgins, J. P. T., Vist, G. E., Glasziou, P., Akl, E. A., Skoetz, </w:t>
+      </w:r>
+      <w:r>
+        <w:rPr>
+          <w:rFonts w:ascii="Times New Roman" w:hAnsi="Times New Roman" w:eastAsia="Times New Roman"/>
+          <w:i/>
+          <w:sz w:val="24"/>
+        </w:rPr>
+        <w:t>N</w:t>
+      </w:r>
+      <w:r>
+        <w:rPr>
+          <w:rFonts w:ascii="Times New Roman" w:hAnsi="Times New Roman" w:eastAsia="Times New Roman"/>
+          <w:sz w:val="24"/>
+        </w:rPr>
+        <w:t xml:space="preserve">., &amp; Guyatt, G. H. (2019). Chapter 14: Completing "Summary of findings" tables and grading the certainty of the evidence. In J. P. T. Higgins, J. Thomas, J. Chandler, </w:t>
+      </w:r>
+      <w:r>
+        <w:rPr>
+          <w:rFonts w:ascii="Times New Roman" w:hAnsi="Times New Roman" w:eastAsia="Times New Roman"/>
+          <w:i/>
+          <w:sz w:val="24"/>
+        </w:rPr>
+        <w:t>M</w:t>
+      </w:r>
+      <w:r>
+        <w:rPr>
+          <w:rFonts w:ascii="Times New Roman" w:hAnsi="Times New Roman" w:eastAsia="Times New Roman"/>
+          <w:sz w:val="24"/>
+        </w:rPr>
+        <w:t xml:space="preserve">. Cumpston, T. Li, </w:t>
+      </w:r>
+      <w:r>
+        <w:rPr>
+          <w:rFonts w:ascii="Times New Roman" w:hAnsi="Times New Roman" w:eastAsia="Times New Roman"/>
+          <w:i/>
+          <w:sz w:val="24"/>
+        </w:rPr>
+        <w:t>M</w:t>
+      </w:r>
+      <w:r>
+        <w:rPr>
+          <w:rFonts w:ascii="Times New Roman" w:hAnsi="Times New Roman" w:eastAsia="Times New Roman"/>
+          <w:sz w:val="24"/>
+        </w:rPr>
+        <w:t>. J. Page, &amp; V. A. Welch (Eds.), Cochrane handbook for systematic reviews of interventions (2nd ed.). John Wiley &amp; Sons.</w:t>
+      </w:r>
+    </w:p>
+    <w:p>
+      <w:pPr>
+        <w:spacing w:line="480" w:lineRule="auto" w:before="0" w:after="0"/>
+        <w:ind w:left="720" w:hanging="720"/>
+      </w:pPr>
+      <w:r>
+        <w:rPr>
+          <w:rFonts w:ascii="Times New Roman" w:hAnsi="Times New Roman" w:eastAsia="Times New Roman"/>
+          <w:sz w:val="24"/>
+        </w:rPr>
+        <w:t xml:space="preserve">Simonsohn, U., Nelson, L. D., &amp; Simmons, J. P. (2014). P-curve: A key to the file-drawer. </w:t>
+      </w:r>
+      <w:r>
+        <w:rPr>
+          <w:rFonts w:ascii="Times New Roman" w:hAnsi="Times New Roman" w:eastAsia="Times New Roman"/>
+          <w:i/>
+          <w:sz w:val="24"/>
+        </w:rPr>
+        <w:t>Journal of Experimental Psychology: General, 143</w:t>
+      </w:r>
+      <w:r>
+        <w:rPr>
+          <w:rFonts w:ascii="Times New Roman" w:hAnsi="Times New Roman" w:eastAsia="Times New Roman"/>
+          <w:sz w:val="24"/>
+        </w:rPr>
+        <w:t>(2), 534–547. https://doi.org/10.1037/a0033242</w:t>
+      </w:r>
+    </w:p>
+    <w:p>
+      <w:pPr>
+        <w:spacing w:line="480" w:lineRule="auto" w:before="0" w:after="0"/>
+        <w:ind w:left="720" w:hanging="720"/>
+      </w:pPr>
+      <w:r>
+        <w:rPr>
+          <w:rFonts w:ascii="Times New Roman" w:hAnsi="Times New Roman" w:eastAsia="Times New Roman"/>
+          <w:sz w:val="24"/>
+        </w:rPr>
+        <w:t xml:space="preserve">Stajkovic, A. D., Bandura, A., Locke, E. A., Lee, D., &amp; Sergent, K. (2018). Test of three conceptual models of influence of the big five personality traits and self-efficacy on academic performance: A meta-analytic path-analysis. </w:t>
+      </w:r>
+      <w:r>
+        <w:rPr>
+          <w:rFonts w:ascii="Times New Roman" w:hAnsi="Times New Roman" w:eastAsia="Times New Roman"/>
+          <w:i/>
+          <w:sz w:val="24"/>
+        </w:rPr>
+        <w:t>Personality and Individual Differences, 120</w:t>
+      </w:r>
+      <w:r>
+        <w:rPr>
+          <w:rFonts w:ascii="Times New Roman" w:hAnsi="Times New Roman" w:eastAsia="Times New Roman"/>
+          <w:sz w:val="24"/>
+        </w:rPr>
+        <w:t>, 238–245. https://doi.org/10.1016/j.paid.2017.08.014</w:t>
+      </w:r>
+    </w:p>
+    <w:p>
+      <w:pPr>
+        <w:spacing w:line="480" w:lineRule="auto" w:before="0" w:after="0"/>
+        <w:ind w:left="720" w:hanging="720"/>
+      </w:pPr>
+      <w:r>
+        <w:rPr>
+          <w:rFonts w:ascii="Times New Roman" w:hAnsi="Times New Roman" w:eastAsia="Times New Roman"/>
+          <w:sz w:val="24"/>
+        </w:rPr>
+        <w:t xml:space="preserve">Tipton, E. (2015). Small sample adjustments for robust variance estimation with meta-regression. </w:t>
+      </w:r>
+      <w:r>
+        <w:rPr>
+          <w:rFonts w:ascii="Times New Roman" w:hAnsi="Times New Roman" w:eastAsia="Times New Roman"/>
+          <w:i/>
+          <w:sz w:val="24"/>
+        </w:rPr>
+        <w:t>Psychological Methods, 20</w:t>
+      </w:r>
+      <w:r>
+        <w:rPr>
+          <w:rFonts w:ascii="Times New Roman" w:hAnsi="Times New Roman" w:eastAsia="Times New Roman"/>
+          <w:sz w:val="24"/>
+        </w:rPr>
+        <w:t>(3), 375–393. https://doi.org/10.1037/met0000011</w:t>
+      </w:r>
+    </w:p>
+    <w:p>
+      <w:pPr>
+        <w:spacing w:line="480" w:lineRule="auto" w:before="0" w:after="0"/>
+        <w:ind w:left="720" w:hanging="720"/>
+      </w:pPr>
+      <w:r>
+        <w:rPr>
+          <w:rFonts w:ascii="Times New Roman" w:hAnsi="Times New Roman" w:eastAsia="Times New Roman"/>
+          <w:sz w:val="24"/>
+        </w:rPr>
+        <w:t xml:space="preserve">Tlili, A., Sun, T., Denden, </w:t>
+      </w:r>
+      <w:r>
+        <w:rPr>
+          <w:rFonts w:ascii="Times New Roman" w:hAnsi="Times New Roman" w:eastAsia="Times New Roman"/>
+          <w:i/>
+          <w:sz w:val="24"/>
+        </w:rPr>
+        <w:t>M</w:t>
+      </w:r>
+      <w:r>
+        <w:rPr>
+          <w:rFonts w:ascii="Times New Roman" w:hAnsi="Times New Roman" w:eastAsia="Times New Roman"/>
+          <w:sz w:val="24"/>
+        </w:rPr>
+        <w:t>., Kinshuk, Graf, S., Fei, C., &amp; Wang, H. (2023). Impact of personality traits on learners' navigational behavior patterns in an online course: A lag sequential analysis approach. Frontiers in Psychology, 14, 1071985. https://doi.org/10.3389/fpsyg.2023.1071985</w:t>
+      </w:r>
+    </w:p>
+    <w:p>
+      <w:pPr>
+        <w:spacing w:line="480" w:lineRule="auto" w:before="0" w:after="0"/>
+        <w:ind w:left="720" w:hanging="720"/>
+      </w:pPr>
+      <w:r>
+        <w:rPr>
+          <w:rFonts w:ascii="Times New Roman" w:hAnsi="Times New Roman" w:eastAsia="Times New Roman"/>
+          <w:sz w:val="24"/>
+        </w:rPr>
+        <w:t>Tokiwa, E. (2025). Big Five personality traits and online learning outcomes in Japanese high school students [Manuscript in preparation]. SUNBLAZE Co., Ltd.</w:t>
+      </w:r>
+    </w:p>
+    <w:p>
+      <w:pPr>
+        <w:spacing w:line="480" w:lineRule="auto" w:before="0" w:after="0"/>
+        <w:ind w:left="720" w:hanging="720"/>
+      </w:pPr>
+      <w:r>
+        <w:rPr>
+          <w:rFonts w:ascii="Times New Roman" w:hAnsi="Times New Roman" w:eastAsia="Times New Roman"/>
+          <w:sz w:val="24"/>
+        </w:rPr>
+        <w:t xml:space="preserve">Vedel, A. (2014). The Big Five and tertiary academic performance: A systematic review and meta-analysis. </w:t>
+      </w:r>
+      <w:r>
+        <w:rPr>
+          <w:rFonts w:ascii="Times New Roman" w:hAnsi="Times New Roman" w:eastAsia="Times New Roman"/>
+          <w:i/>
+          <w:sz w:val="24"/>
+        </w:rPr>
+        <w:t>Personality and Individual Differences, 71</w:t>
+      </w:r>
+      <w:r>
+        <w:rPr>
+          <w:rFonts w:ascii="Times New Roman" w:hAnsi="Times New Roman" w:eastAsia="Times New Roman"/>
+          <w:sz w:val="24"/>
+        </w:rPr>
+        <w:t>, 66–76. https://doi.org/10.1016/j.paid.2014.07.011</w:t>
+      </w:r>
+    </w:p>
+    <w:p>
+      <w:pPr>
+        <w:spacing w:line="480" w:lineRule="auto" w:before="0" w:after="0"/>
+        <w:ind w:left="720" w:hanging="720"/>
+      </w:pPr>
+      <w:r>
+        <w:rPr>
+          <w:rFonts w:ascii="Times New Roman" w:hAnsi="Times New Roman" w:eastAsia="Times New Roman"/>
+          <w:sz w:val="24"/>
+        </w:rPr>
+        <w:t xml:space="preserve">Viechtbauer, W. (2010). Conducting meta-analyses in R with the metafor package. </w:t>
+      </w:r>
+      <w:r>
+        <w:rPr>
+          <w:rFonts w:ascii="Times New Roman" w:hAnsi="Times New Roman" w:eastAsia="Times New Roman"/>
+          <w:i/>
+          <w:sz w:val="24"/>
+        </w:rPr>
+        <w:t>Journal of Statistical Software, 36</w:t>
+      </w:r>
+      <w:r>
+        <w:rPr>
+          <w:rFonts w:ascii="Times New Roman" w:hAnsi="Times New Roman" w:eastAsia="Times New Roman"/>
+          <w:sz w:val="24"/>
+        </w:rPr>
+        <w:t>(3), 1–48. https://doi.org/10.18637/jss.v036.i03</w:t>
+      </w:r>
+    </w:p>
+    <w:p>
+      <w:pPr>
+        <w:spacing w:line="480" w:lineRule="auto" w:before="0" w:after="0"/>
+        <w:ind w:left="720" w:hanging="720"/>
+      </w:pPr>
+      <w:r>
+        <w:rPr>
+          <w:rFonts w:ascii="Times New Roman" w:hAnsi="Times New Roman" w:eastAsia="Times New Roman"/>
+          <w:sz w:val="24"/>
+        </w:rPr>
+        <w:t xml:space="preserve">Wang, P., Wang, </w:t>
+      </w:r>
+      <w:r>
+        <w:rPr>
+          <w:rFonts w:ascii="Times New Roman" w:hAnsi="Times New Roman" w:eastAsia="Times New Roman"/>
+          <w:i/>
+          <w:sz w:val="24"/>
+        </w:rPr>
+        <w:t>F</w:t>
+      </w:r>
+      <w:r>
+        <w:rPr>
+          <w:rFonts w:ascii="Times New Roman" w:hAnsi="Times New Roman" w:eastAsia="Times New Roman"/>
+          <w:sz w:val="24"/>
+        </w:rPr>
+        <w:t>., &amp; Li, Z. (2023). Exploring the ecosystem of K-12 online learning: An empirical study of impact mechanisms in the post-pandemic era. Frontiers in Psychology, 14, 1241477. https://doi.org/10.3389/fpsyg.2023.1241477</w:t>
+      </w:r>
+    </w:p>
+    <w:p>
+      <w:pPr>
+        <w:spacing w:line="480" w:lineRule="auto" w:before="0" w:after="0"/>
+        <w:ind w:left="720" w:hanging="720"/>
+      </w:pPr>
+      <w:r>
+        <w:rPr>
+          <w:rFonts w:ascii="Times New Roman" w:hAnsi="Times New Roman" w:eastAsia="Times New Roman"/>
+          <w:sz w:val="24"/>
+        </w:rPr>
+        <w:t xml:space="preserve">Yu, Z. (2021). The effects of gender, educational level, and personality on online learning outcomes during the COVID-19 pandemic. </w:t>
+      </w:r>
+      <w:r>
+        <w:rPr>
+          <w:rFonts w:ascii="Times New Roman" w:hAnsi="Times New Roman" w:eastAsia="Times New Roman"/>
+          <w:i/>
+          <w:sz w:val="24"/>
+        </w:rPr>
+        <w:t>International Journal of Educational Technology in Higher Education, 18</w:t>
+      </w:r>
+      <w:r>
+        <w:rPr>
+          <w:rFonts w:ascii="Times New Roman" w:hAnsi="Times New Roman" w:eastAsia="Times New Roman"/>
+          <w:sz w:val="24"/>
+        </w:rPr>
+        <w:t>, Article 14. https://doi.org/10.1186/s41239-021-00252-3</w:t>
+      </w:r>
+    </w:p>
+    <w:p>
+      <w:pPr>
+        <w:spacing w:line="480" w:lineRule="auto" w:before="0" w:after="0"/>
+        <w:ind w:left="720" w:hanging="720"/>
+      </w:pPr>
+      <w:r>
+        <w:rPr>
+          <w:rFonts w:ascii="Times New Roman" w:hAnsi="Times New Roman" w:eastAsia="Times New Roman"/>
+          <w:sz w:val="24"/>
+        </w:rPr>
         <w:t xml:space="preserve">Zell, E., &amp; Lesick, T. L. (2022). Big five personality traits and performance: A quantitative synthesis of 50+ meta-analyses. </w:t>
       </w:r>
       <w:r>
@@ -7786,6 +8219,34 @@
           <w:sz w:val="24"/>
         </w:rPr>
         <w:t>(4), 559–573. https://doi.org/10.1111/jopy.12683</w:t>
+      </w:r>
+    </w:p>
+    <w:p>
+      <w:pPr>
+        <w:spacing w:line="480" w:lineRule="auto" w:before="0" w:after="0"/>
+        <w:ind w:left="720" w:hanging="720"/>
+      </w:pPr>
+      <w:r>
+        <w:rPr>
+          <w:rFonts w:ascii="Times New Roman" w:hAnsi="Times New Roman" w:eastAsia="Times New Roman"/>
+          <w:sz w:val="24"/>
+        </w:rPr>
+        <w:t xml:space="preserve">Zheng, Y., &amp; Zheng, S. (2023). Exploring educational impacts among pre, during and post COVID-19 lockdowns from students with different personality traits. </w:t>
+      </w:r>
+      <w:r>
+        <w:rPr>
+          <w:rFonts w:ascii="Times New Roman" w:hAnsi="Times New Roman" w:eastAsia="Times New Roman"/>
+          <w:i/>
+          <w:sz w:val="24"/>
+        </w:rPr>
+        <w:t>International Journal of Educational Technology in Higher Education, 20</w:t>
+      </w:r>
+      <w:r>
+        <w:rPr>
+          <w:rFonts w:ascii="Times New Roman" w:hAnsi="Times New Roman" w:eastAsia="Times New Roman"/>
+          <w:sz w:val="24"/>
+        </w:rPr>
+        <w:t>(1), 21. https://doi.org/10.1186/s41239-023-00388-4</w:t>
       </w:r>
     </w:p>
     <w:p>
@@ -22942,7 +23403,7 @@
           <w:rFonts w:ascii="Times New Roman" w:hAnsi="Times New Roman" w:eastAsia="Times New Roman"/>
           <w:sz w:val="24"/>
         </w:rPr>
-        <w:t xml:space="preserve"> = 40 removed), 80 records underwent title and abstract screening, with 25 excluded primarily for wrong population, non-Big-Five personality frameworks, or no online learning component. Of 43 full-text reports sought, 5 were not retrievable (paywall), and 38 were assessed for eligibility. Seven reports were excluded at the full-text stage with explicit reasons: non-Big-Five framework (</w:t>
+        <w:t xml:space="preserve"> = 40 removed), 80 records underwent title and abstract screening, with 25 excluded primarily for wrong population, non-Big-Five personality frameworks, or no online learning component. Of 43 full-text reports sought, 5 were not retrievable (paywall), and 38 were assessed for eligibility. Eleven reports were excluded at the full-text stage with explicit reasons: non-Big-Five framework (</w:t>
       </w:r>
       <w:r>
         <w:rPr>
@@ -23002,7 +23463,7 @@
           <w:rFonts w:ascii="Times New Roman" w:hAnsi="Times New Roman" w:eastAsia="Times New Roman"/>
           <w:sz w:val="24"/>
         </w:rPr>
-        <w:t xml:space="preserve"> = 1; A-24 Tlili et al., 2023, lag sequential analysis). The 31 remaining studies were included in the systematic review; 10 contributed direct Pearson correlations to the primary achievement pool, 4 contributed β-converted effect sizes via Peterson and Brown's (2005) approximation, and 17 were retained for secondary analyses or narrative synthesis.</w:t>
+        <w:t xml:space="preserve"> = 1; A-24 Tlili et al., 2023, lag sequential analysis). The remaining studies, supplemented by four newly identified primary studies (A-29 Bahçekapılı &amp; Karaman, 2020; A-30 Kaspar et al., 2023; A-31 Rivers, 2021; A-37 Zheng &amp; Zheng, 2023), yielded 31 primary studies that were retained for the systematic review; of these, 10 contributed direct Pearson correlations or β-converted effect sizes to the primary achievement pool (with two studies — A-28 Yu, 2021 and A-30 Kaspar et al., 2023 — providing β-converted effect sizes via Peterson and Brown's, 2005, approximation), and the remainder were retained for secondary analyses or narrative synthesis.</w:t>
       </w:r>
     </w:p>
     <w:p>

</xml_diff>